<commit_message>
fix: Word export matching - LCS/max + strip leading numbers for correct item mapping
Made-with: Cursor
</commit_message>
<xml_diff>
--- a/계약서/2026 MC 표준 마케팅 계약서(SBS-MC)_2602.docx
+++ b/계약서/2026 MC 표준 마케팅 계약서(SBS-MC)_2602.docx
@@ -937,6 +937,7 @@
         </w:rPr>
         <w:t>㈜</w:t>
       </w:r>
+      <w:proofErr w:type="spellStart"/>
       <w:r>
         <w:rPr>
           <w:rFonts w:asciiTheme="minorEastAsia" w:eastAsiaTheme="minorEastAsia" w:hAnsiTheme="minorEastAsia" w:cs="굴림" w:hint="eastAsia"/>
@@ -945,8 +946,9 @@
           <w:sz w:val="22"/>
           <w:szCs w:val="22"/>
         </w:rPr>
-        <w:t>에스비에스(이하 “SBS”라 한다)</w:t>
-      </w:r>
+        <w:t>에스비에스</w:t>
+      </w:r>
+      <w:proofErr w:type="spellEnd"/>
       <w:r>
         <w:rPr>
           <w:rFonts w:asciiTheme="minorEastAsia" w:eastAsiaTheme="minorEastAsia" w:hAnsiTheme="minorEastAsia" w:cs="굴림" w:hint="eastAsia"/>
@@ -955,6 +957,16 @@
           <w:sz w:val="22"/>
           <w:szCs w:val="22"/>
         </w:rPr>
+        <w:t>(이하 “SBS”라 한다)</w:t>
+      </w:r>
+      <w:r>
+        <w:rPr>
+          <w:rFonts w:asciiTheme="minorEastAsia" w:eastAsiaTheme="minorEastAsia" w:hAnsiTheme="minorEastAsia" w:cs="굴림" w:hint="eastAsia"/>
+          <w:color w:val="auto"/>
+          <w:spacing w:val="4"/>
+          <w:sz w:val="22"/>
+          <w:szCs w:val="22"/>
+        </w:rPr>
         <w:t xml:space="preserve">와 </w:t>
       </w:r>
       <w:r>
@@ -1000,6 +1012,7 @@
         </w:rPr>
         <w:t>(이하 “</w:t>
       </w:r>
+      <w:proofErr w:type="spellStart"/>
       <w:r>
         <w:rPr>
           <w:rFonts w:asciiTheme="minorEastAsia" w:eastAsiaTheme="minorEastAsia" w:hAnsiTheme="minorEastAsia" w:cs="굴림" w:hint="eastAsia"/>
@@ -1018,8 +1031,9 @@
           <w:sz w:val="22"/>
           <w:szCs w:val="22"/>
         </w:rPr>
-        <w:t>”라 한다)</w:t>
-      </w:r>
+        <w:t>”라</w:t>
+      </w:r>
+      <w:proofErr w:type="spellEnd"/>
       <w:r>
         <w:rPr>
           <w:rFonts w:asciiTheme="minorEastAsia" w:eastAsiaTheme="minorEastAsia" w:hAnsiTheme="minorEastAsia" w:cs="굴림" w:hint="eastAsia"/>
@@ -1028,6 +1042,16 @@
           <w:sz w:val="22"/>
           <w:szCs w:val="22"/>
         </w:rPr>
+        <w:t xml:space="preserve"> 한다)</w:t>
+      </w:r>
+      <w:r>
+        <w:rPr>
+          <w:rFonts w:asciiTheme="minorEastAsia" w:eastAsiaTheme="minorEastAsia" w:hAnsiTheme="minorEastAsia" w:cs="굴림" w:hint="eastAsia"/>
+          <w:color w:val="auto"/>
+          <w:spacing w:val="-2"/>
+          <w:sz w:val="22"/>
+          <w:szCs w:val="22"/>
+        </w:rPr>
         <w:t>의 광고 업무를 대행하</w:t>
       </w:r>
       <w:r>
@@ -1050,6 +1074,7 @@
         </w:rPr>
         <w:t>㈜</w:t>
       </w:r>
+      <w:proofErr w:type="spellStart"/>
       <w:r>
         <w:rPr>
           <w:rFonts w:asciiTheme="minorEastAsia" w:eastAsiaTheme="minorEastAsia" w:hAnsiTheme="minorEastAsia" w:cs="굴림" w:hint="eastAsia"/>
@@ -1078,18 +1103,30 @@
           <w:sz w:val="22"/>
           <w:szCs w:val="22"/>
         </w:rPr>
-        <w:t xml:space="preserve">에스엠앤씨(이하 </w:t>
-      </w:r>
-      <w:r>
-        <w:rPr>
-          <w:rFonts w:asciiTheme="minorEastAsia" w:eastAsiaTheme="minorEastAsia" w:hAnsiTheme="minorEastAsia" w:cs="굴림"/>
+        <w:t>에스엠앤씨</w:t>
+      </w:r>
+      <w:proofErr w:type="spellEnd"/>
+      <w:r>
+        <w:rPr>
+          <w:rFonts w:asciiTheme="minorEastAsia" w:eastAsiaTheme="minorEastAsia" w:hAnsiTheme="minorEastAsia" w:cs="굴림" w:hint="eastAsia"/>
           <w:color w:val="auto"/>
           <w:spacing w:val="10"/>
           <w:sz w:val="22"/>
           <w:szCs w:val="22"/>
         </w:rPr>
+        <w:t xml:space="preserve">(이하 </w:t>
+      </w:r>
+      <w:r>
+        <w:rPr>
+          <w:rFonts w:asciiTheme="minorEastAsia" w:eastAsiaTheme="minorEastAsia" w:hAnsiTheme="minorEastAsia" w:cs="굴림"/>
+          <w:color w:val="auto"/>
+          <w:spacing w:val="10"/>
+          <w:sz w:val="22"/>
+          <w:szCs w:val="22"/>
+        </w:rPr>
         <w:t>“</w:t>
       </w:r>
+      <w:proofErr w:type="spellStart"/>
       <w:r>
         <w:rPr>
           <w:rFonts w:asciiTheme="minorEastAsia" w:eastAsiaTheme="minorEastAsia" w:hAnsiTheme="minorEastAsia" w:cs="굴림" w:hint="eastAsia"/>
@@ -1100,6 +1137,7 @@
         </w:rPr>
         <w:t>미디어렙</w:t>
       </w:r>
+      <w:proofErr w:type="spellEnd"/>
       <w:r>
         <w:rPr>
           <w:rFonts w:asciiTheme="minorEastAsia" w:eastAsiaTheme="minorEastAsia" w:hAnsiTheme="minorEastAsia" w:cs="굴림"/>
@@ -1194,17 +1232,6 @@
         <w:rPr>
           <w:rFonts w:asciiTheme="minorEastAsia" w:eastAsiaTheme="minorEastAsia" w:hAnsiTheme="minorEastAsia" w:cs="굴림" w:hint="eastAsia"/>
           <w:color w:val="auto"/>
-          <w:spacing w:val="10"/>
-          <w:sz w:val="22"/>
-          <w:szCs w:val="22"/>
-          <w:highlight w:val="yellow"/>
-        </w:rPr>
-        <w:t>[</w:t>
-      </w:r>
-      <w:r>
-        <w:rPr>
-          <w:rFonts w:asciiTheme="minorEastAsia" w:eastAsiaTheme="minorEastAsia" w:hAnsiTheme="minorEastAsia" w:cs="굴림" w:hint="eastAsia"/>
-          <w:color w:val="auto"/>
           <w:spacing w:val="6"/>
           <w:sz w:val="22"/>
           <w:szCs w:val="22"/>
@@ -1233,17 +1260,6 @@
           <w:highlight w:val="yellow"/>
         </w:rPr>
         <w:t>&gt;</w:t>
-      </w:r>
-      <w:r>
-        <w:rPr>
-          <w:rFonts w:asciiTheme="minorEastAsia" w:eastAsiaTheme="minorEastAsia" w:hAnsiTheme="minorEastAsia" w:cs="굴림" w:hint="eastAsia"/>
-          <w:color w:val="auto"/>
-          <w:spacing w:val="6"/>
-          <w:sz w:val="22"/>
-          <w:szCs w:val="22"/>
-          <w:highlight w:val="yellow"/>
-        </w:rPr>
-        <w:t>]</w:t>
       </w:r>
       <w:r>
         <w:rPr>
@@ -1350,16 +1366,29 @@
           <w:szCs w:val="22"/>
         </w:rPr>
       </w:pPr>
-      <w:r>
-        <w:rPr>
-          <w:rFonts w:asciiTheme="minorEastAsia" w:eastAsiaTheme="minorEastAsia" w:hAnsiTheme="minorEastAsia" w:cs="굴림" w:hint="eastAsia"/>
-          <w:b/>
-          <w:bCs/>
-          <w:color w:val="auto"/>
-          <w:sz w:val="22"/>
-          <w:szCs w:val="22"/>
-        </w:rPr>
-        <w:t>제 1 조 (계약의 목적)</w:t>
+      <w:proofErr w:type="gramStart"/>
+      <w:r>
+        <w:rPr>
+          <w:rFonts w:asciiTheme="minorEastAsia" w:eastAsiaTheme="minorEastAsia" w:hAnsiTheme="minorEastAsia" w:cs="굴림" w:hint="eastAsia"/>
+          <w:b/>
+          <w:bCs/>
+          <w:color w:val="auto"/>
+          <w:sz w:val="22"/>
+          <w:szCs w:val="22"/>
+        </w:rPr>
+        <w:t>제 1</w:t>
+      </w:r>
+      <w:proofErr w:type="gramEnd"/>
+      <w:r>
+        <w:rPr>
+          <w:rFonts w:asciiTheme="minorEastAsia" w:eastAsiaTheme="minorEastAsia" w:hAnsiTheme="minorEastAsia" w:cs="굴림" w:hint="eastAsia"/>
+          <w:b/>
+          <w:bCs/>
+          <w:color w:val="auto"/>
+          <w:sz w:val="22"/>
+          <w:szCs w:val="22"/>
+        </w:rPr>
+        <w:t xml:space="preserve"> 조 (계약의 목적)</w:t>
       </w:r>
     </w:p>
     <w:p>
@@ -1442,8 +1471,9 @@
           <w:sz w:val="22"/>
           <w:szCs w:val="22"/>
         </w:rPr>
-        <w:t>과 관련하여, “광</w:t>
-      </w:r>
+        <w:t>과 관련하여, “</w:t>
+      </w:r>
+      <w:proofErr w:type="spellStart"/>
       <w:r>
         <w:rPr>
           <w:rFonts w:asciiTheme="minorEastAsia" w:eastAsiaTheme="minorEastAsia" w:hAnsiTheme="minorEastAsia" w:cs="굴림" w:hint="eastAsia"/>
@@ -1452,6 +1482,16 @@
           <w:sz w:val="22"/>
           <w:szCs w:val="22"/>
         </w:rPr>
+        <w:t>광</w:t>
+      </w:r>
+      <w:r>
+        <w:rPr>
+          <w:rFonts w:asciiTheme="minorEastAsia" w:eastAsiaTheme="minorEastAsia" w:hAnsiTheme="minorEastAsia" w:cs="굴림" w:hint="eastAsia"/>
+          <w:color w:val="auto"/>
+          <w:spacing w:val="6"/>
+          <w:sz w:val="22"/>
+          <w:szCs w:val="22"/>
+        </w:rPr>
         <w:t>고주</w:t>
       </w:r>
       <w:r>
@@ -1462,8 +1502,9 @@
           <w:sz w:val="22"/>
           <w:szCs w:val="22"/>
         </w:rPr>
-        <w:t xml:space="preserve">”가 </w:t>
-      </w:r>
+        <w:t>”가</w:t>
+      </w:r>
+      <w:proofErr w:type="spellEnd"/>
       <w:r>
         <w:rPr>
           <w:rFonts w:asciiTheme="minorEastAsia" w:eastAsiaTheme="minorEastAsia" w:hAnsiTheme="minorEastAsia" w:cs="굴림" w:hint="eastAsia"/>
@@ -1471,6 +1512,16 @@
           <w:spacing w:val="6"/>
           <w:sz w:val="22"/>
           <w:szCs w:val="22"/>
+        </w:rPr>
+        <w:t xml:space="preserve"> </w:t>
+      </w:r>
+      <w:r>
+        <w:rPr>
+          <w:rFonts w:asciiTheme="minorEastAsia" w:eastAsiaTheme="minorEastAsia" w:hAnsiTheme="minorEastAsia" w:cs="굴림" w:hint="eastAsia"/>
+          <w:color w:val="auto"/>
+          <w:spacing w:val="6"/>
+          <w:sz w:val="22"/>
+          <w:szCs w:val="22"/>
           <w:highlight w:val="yellow"/>
         </w:rPr>
         <w:t>[</w:t>
@@ -1589,6 +1640,7 @@
         </w:rPr>
         <w:t>“</w:t>
       </w:r>
+      <w:proofErr w:type="spellStart"/>
       <w:r>
         <w:rPr>
           <w:rFonts w:asciiTheme="minorEastAsia" w:eastAsiaTheme="minorEastAsia" w:hAnsiTheme="minorEastAsia" w:cs="굴림" w:hint="eastAsia"/>
@@ -1598,6 +1650,7 @@
         </w:rPr>
         <w:t>미디어렙</w:t>
       </w:r>
+      <w:proofErr w:type="spellEnd"/>
       <w:r>
         <w:rPr>
           <w:rFonts w:asciiTheme="minorEastAsia" w:eastAsiaTheme="minorEastAsia" w:hAnsiTheme="minorEastAsia" w:cs="굴림"/>
@@ -1659,16 +1712,29 @@
           <w:szCs w:val="22"/>
         </w:rPr>
       </w:pPr>
-      <w:r>
-        <w:rPr>
-          <w:rFonts w:asciiTheme="minorEastAsia" w:eastAsiaTheme="minorEastAsia" w:hAnsiTheme="minorEastAsia" w:cs="굴림" w:hint="eastAsia"/>
-          <w:b/>
-          <w:bCs/>
-          <w:color w:val="auto"/>
-          <w:sz w:val="22"/>
-          <w:szCs w:val="22"/>
-        </w:rPr>
-        <w:t>제 2 조 (계약기간)</w:t>
+      <w:proofErr w:type="gramStart"/>
+      <w:r>
+        <w:rPr>
+          <w:rFonts w:asciiTheme="minorEastAsia" w:eastAsiaTheme="minorEastAsia" w:hAnsiTheme="minorEastAsia" w:cs="굴림" w:hint="eastAsia"/>
+          <w:b/>
+          <w:bCs/>
+          <w:color w:val="auto"/>
+          <w:sz w:val="22"/>
+          <w:szCs w:val="22"/>
+        </w:rPr>
+        <w:t>제 2</w:t>
+      </w:r>
+      <w:proofErr w:type="gramEnd"/>
+      <w:r>
+        <w:rPr>
+          <w:rFonts w:asciiTheme="minorEastAsia" w:eastAsiaTheme="minorEastAsia" w:hAnsiTheme="minorEastAsia" w:cs="굴림" w:hint="eastAsia"/>
+          <w:b/>
+          <w:bCs/>
+          <w:color w:val="auto"/>
+          <w:sz w:val="22"/>
+          <w:szCs w:val="22"/>
+        </w:rPr>
+        <w:t xml:space="preserve"> 조 (계약기간)</w:t>
       </w:r>
     </w:p>
     <w:p>
@@ -1720,6 +1786,7 @@
         </w:rPr>
         <w:t>”, “</w:t>
       </w:r>
+      <w:proofErr w:type="spellStart"/>
       <w:r>
         <w:rPr>
           <w:rFonts w:asciiTheme="minorEastAsia" w:eastAsiaTheme="minorEastAsia" w:hAnsiTheme="minorEastAsia" w:cs="굴림" w:hint="eastAsia"/>
@@ -1729,6 +1796,7 @@
         </w:rPr>
         <w:t>미디어렙</w:t>
       </w:r>
+      <w:proofErr w:type="spellEnd"/>
       <w:r>
         <w:rPr>
           <w:rFonts w:asciiTheme="minorEastAsia" w:eastAsiaTheme="minorEastAsia" w:hAnsiTheme="minorEastAsia" w:cs="굴림"/>
@@ -1774,17 +1842,39 @@
           <w:sz w:val="22"/>
           <w:szCs w:val="22"/>
         </w:rPr>
-        <w:t xml:space="preserve"> 시점</w:t>
-      </w:r>
-      <w:r>
-        <w:rPr>
-          <w:rFonts w:asciiTheme="minorEastAsia" w:eastAsiaTheme="minorEastAsia" w:hAnsiTheme="minorEastAsia" w:cs="굴림" w:hint="eastAsia"/>
-          <w:bCs/>
-          <w:color w:val="auto"/>
-          <w:sz w:val="22"/>
-          <w:szCs w:val="22"/>
-        </w:rPr>
-        <w:t>까지로 한다.</w:t>
+        <w:t xml:space="preserve"> </w:t>
+      </w:r>
+      <w:proofErr w:type="spellStart"/>
+      <w:r>
+        <w:rPr>
+          <w:rFonts w:asciiTheme="minorEastAsia" w:eastAsiaTheme="minorEastAsia" w:hAnsiTheme="minorEastAsia" w:cs="굴림" w:hint="eastAsia"/>
+          <w:bCs/>
+          <w:color w:val="auto"/>
+          <w:sz w:val="22"/>
+          <w:szCs w:val="22"/>
+        </w:rPr>
+        <w:t>시점</w:t>
+      </w:r>
+      <w:r>
+        <w:rPr>
+          <w:rFonts w:asciiTheme="minorEastAsia" w:eastAsiaTheme="minorEastAsia" w:hAnsiTheme="minorEastAsia" w:cs="굴림" w:hint="eastAsia"/>
+          <w:bCs/>
+          <w:color w:val="auto"/>
+          <w:sz w:val="22"/>
+          <w:szCs w:val="22"/>
+        </w:rPr>
+        <w:t>까지로</w:t>
+      </w:r>
+      <w:proofErr w:type="spellEnd"/>
+      <w:r>
+        <w:rPr>
+          <w:rFonts w:asciiTheme="minorEastAsia" w:eastAsiaTheme="minorEastAsia" w:hAnsiTheme="minorEastAsia" w:cs="굴림" w:hint="eastAsia"/>
+          <w:bCs/>
+          <w:color w:val="auto"/>
+          <w:sz w:val="22"/>
+          <w:szCs w:val="22"/>
+        </w:rPr>
+        <w:t xml:space="preserve"> 한다.</w:t>
       </w:r>
     </w:p>
     <w:p>
@@ -1811,6 +1901,7 @@
           <w:szCs w:val="22"/>
         </w:rPr>
       </w:pPr>
+      <w:proofErr w:type="gramStart"/>
       <w:r>
         <w:rPr>
           <w:rFonts w:asciiTheme="minorEastAsia" w:eastAsiaTheme="minorEastAsia" w:hAnsiTheme="minorEastAsia" w:cs="굴림" w:hint="eastAsia"/>
@@ -1833,6 +1924,7 @@
         </w:rPr>
         <w:t>3</w:t>
       </w:r>
+      <w:proofErr w:type="gramEnd"/>
       <w:r>
         <w:rPr>
           <w:rFonts w:asciiTheme="minorEastAsia" w:eastAsiaTheme="minorEastAsia" w:hAnsiTheme="minorEastAsia" w:cs="굴림" w:hint="eastAsia"/>
@@ -1904,45 +1996,8 @@
           <w:color w:val="auto"/>
           <w:sz w:val="22"/>
           <w:szCs w:val="22"/>
-          <w:highlight w:val="yellow"/>
-        </w:rPr>
-      </w:pPr>
-      <w:commentRangeStart w:id="0"/>
-      <w:r>
-        <w:rPr>
-          <w:rFonts w:asciiTheme="minorEastAsia" w:eastAsiaTheme="minorEastAsia" w:hAnsiTheme="minorEastAsia" w:cs="굴림" w:hint="eastAsia"/>
-          <w:bCs/>
-          <w:color w:val="auto"/>
-          <w:sz w:val="22"/>
-          <w:szCs w:val="22"/>
-          <w:highlight w:val="yellow"/>
-        </w:rPr>
-        <w:t>1</w:t>
-      </w:r>
-      <w:commentRangeEnd w:id="0"/>
-      <w:r>
-        <w:rPr>
-          <w:rStyle w:val="a7"/>
-          <w:rFonts w:asciiTheme="minorEastAsia" w:eastAsiaTheme="minorEastAsia" w:hAnsiTheme="minorEastAsia" w:cs="굴림" w:hint="eastAsia"/>
-          <w:bCs/>
-          <w:color w:val="auto"/>
-          <w:sz w:val="22"/>
-          <w:szCs w:val="22"/>
-          <w:highlight w:val="yellow"/>
-        </w:rPr>
-        <w:commentReference w:id="0"/>
-      </w:r>
-      <w:r>
-        <w:rPr>
-          <w:rFonts w:asciiTheme="minorEastAsia" w:eastAsiaTheme="minorEastAsia" w:hAnsiTheme="minorEastAsia" w:cs="굴림" w:hint="eastAsia"/>
-          <w:bCs/>
-          <w:color w:val="auto"/>
-          <w:sz w:val="22"/>
-          <w:szCs w:val="22"/>
-          <w:highlight w:val="yellow"/>
-        </w:rPr>
-        <w:t>. 간접광고 : “SBS”가 “광고주” 에게 판매하는 간접광고로써 방송법 제73조 제2항 제6호 및 제7호에 규정된 방송광고를 의미한다.</w:t>
-      </w:r>
+        </w:rPr>
+      </w:pPr>
     </w:p>
     <w:p>
       <w:pPr>
@@ -1959,60 +2014,49 @@
       </w:pPr>
       <w:r>
         <w:rPr>
-          <w:rFonts w:asciiTheme="minorEastAsia" w:eastAsiaTheme="minorEastAsia" w:hAnsiTheme="minorEastAsia" w:cs="굴림"/>
-          <w:bCs/>
-          <w:color w:val="auto"/>
-          <w:sz w:val="22"/>
-          <w:szCs w:val="22"/>
-          <w:highlight w:val="yellow"/>
-        </w:rPr>
-        <w:t xml:space="preserve">2. </w:t>
-      </w:r>
-      <w:r>
-        <w:rPr>
-          <w:rFonts w:asciiTheme="minorEastAsia" w:eastAsiaTheme="minorEastAsia" w:hAnsiTheme="minorEastAsia" w:cs="굴림" w:hint="eastAsia"/>
-          <w:bCs/>
-          <w:color w:val="auto"/>
-          <w:sz w:val="22"/>
-          <w:szCs w:val="22"/>
-          <w:highlight w:val="yellow"/>
-        </w:rPr>
-        <w:t xml:space="preserve">디지털 브랜디드 콘텐츠 </w:t>
-      </w:r>
-      <w:r>
-        <w:rPr>
-          <w:rFonts w:asciiTheme="minorEastAsia" w:eastAsiaTheme="minorEastAsia" w:hAnsiTheme="minorEastAsia" w:cs="굴림"/>
-          <w:bCs/>
-          <w:color w:val="auto"/>
-          <w:sz w:val="22"/>
-          <w:szCs w:val="22"/>
-          <w:highlight w:val="yellow"/>
-        </w:rPr>
-        <w:t>:</w:t>
-      </w:r>
-      <w:r>
-        <w:rPr>
-          <w:rFonts w:asciiTheme="minorEastAsia" w:eastAsiaTheme="minorEastAsia" w:hAnsiTheme="minorEastAsia" w:cs="굴림" w:hint="eastAsia"/>
-          <w:bCs/>
-          <w:color w:val="auto"/>
-          <w:spacing w:val="-2"/>
-          <w:sz w:val="22"/>
-          <w:szCs w:val="22"/>
-          <w:highlight w:val="yellow"/>
-        </w:rPr>
-        <w:t xml:space="preserve"> </w:t>
-      </w:r>
-      <w:r>
-        <w:rPr>
-          <w:rFonts w:asciiTheme="minorEastAsia" w:eastAsiaTheme="minorEastAsia" w:hAnsiTheme="minorEastAsia" w:cs="굴림" w:hint="eastAsia"/>
-          <w:bCs/>
-          <w:color w:val="auto"/>
-          <w:spacing w:val="-2"/>
-          <w:sz w:val="22"/>
-          <w:szCs w:val="22"/>
-          <w:highlight w:val="yellow"/>
-        </w:rPr>
-        <w:t>브랜드 맞춤 디지털 콘텐츠를 별도로 제작 및 업로드하는 협찬을 의미한다.</w:t>
+          <w:rFonts w:asciiTheme="minorEastAsia" w:eastAsiaTheme="minorEastAsia" w:hAnsiTheme="minorEastAsia" w:cs="굴림" w:hint="eastAsia"/>
+          <w:bCs/>
+          <w:color w:val="auto"/>
+          <w:sz w:val="22"/>
+          <w:szCs w:val="22"/>
+          <w:highlight w:val="yellow"/>
+        </w:rPr>
+        <w:t>1</w:t>
+      </w:r>
+      <w:r>
+        <w:rPr>
+          <w:rFonts w:asciiTheme="minorEastAsia" w:eastAsiaTheme="minorEastAsia" w:hAnsiTheme="minorEastAsia" w:cs="굴림" w:hint="eastAsia"/>
+          <w:bCs/>
+          <w:color w:val="auto"/>
+          <w:sz w:val="22"/>
+          <w:szCs w:val="22"/>
+          <w:highlight w:val="yellow"/>
+        </w:rPr>
+        <w:t xml:space="preserve">. </w:t>
+      </w:r>
+      <w:proofErr w:type="gramStart"/>
+      <w:r>
+        <w:rPr>
+          <w:rFonts w:asciiTheme="minorEastAsia" w:eastAsiaTheme="minorEastAsia" w:hAnsiTheme="minorEastAsia" w:cs="굴림" w:hint="eastAsia"/>
+          <w:bCs/>
+          <w:color w:val="auto"/>
+          <w:sz w:val="22"/>
+          <w:szCs w:val="22"/>
+          <w:highlight w:val="yellow"/>
+        </w:rPr>
+        <w:t>간접광고 :</w:t>
+      </w:r>
+      <w:proofErr w:type="gramEnd"/>
+      <w:r>
+        <w:rPr>
+          <w:rFonts w:asciiTheme="minorEastAsia" w:eastAsiaTheme="minorEastAsia" w:hAnsiTheme="minorEastAsia" w:cs="굴림" w:hint="eastAsia"/>
+          <w:bCs/>
+          <w:color w:val="auto"/>
+          <w:sz w:val="22"/>
+          <w:szCs w:val="22"/>
+          <w:highlight w:val="yellow"/>
+        </w:rPr>
+        <w:t xml:space="preserve"> “SBS”가 “광고주” 에게 판매하는 간접광고로써 방송법 제73조 제2항 제6호 및 제7호에 규정된 방송광고를 의미한다.</w:t>
       </w:r>
     </w:p>
     <w:p>
@@ -2037,22 +2081,35 @@
           <w:szCs w:val="22"/>
           <w:highlight w:val="yellow"/>
         </w:rPr>
-        <w:t xml:space="preserve">3. </w:t>
-      </w:r>
-      <w:r>
-        <w:rPr>
-          <w:rFonts w:asciiTheme="minorEastAsia" w:eastAsiaTheme="minorEastAsia" w:hAnsiTheme="minorEastAsia" w:cs="굴림" w:hint="eastAsia"/>
-          <w:bCs/>
-          <w:color w:val="auto"/>
-          <w:sz w:val="22"/>
-          <w:szCs w:val="22"/>
-          <w:highlight w:val="yellow"/>
-        </w:rPr>
-        <w:t>유튜브 브랜디드</w:t>
-      </w:r>
-      <w:r>
-        <w:rPr>
-          <w:rFonts w:asciiTheme="minorEastAsia" w:eastAsiaTheme="minorEastAsia" w:hAnsiTheme="minorEastAsia" w:cs="굴림"/>
+        <w:t xml:space="preserve">2. </w:t>
+      </w:r>
+      <w:r>
+        <w:rPr>
+          <w:rFonts w:asciiTheme="minorEastAsia" w:eastAsiaTheme="minorEastAsia" w:hAnsiTheme="minorEastAsia" w:cs="굴림" w:hint="eastAsia"/>
+          <w:bCs/>
+          <w:color w:val="auto"/>
+          <w:sz w:val="22"/>
+          <w:szCs w:val="22"/>
+          <w:highlight w:val="yellow"/>
+        </w:rPr>
+        <w:t xml:space="preserve">디지털 </w:t>
+      </w:r>
+      <w:proofErr w:type="spellStart"/>
+      <w:r>
+        <w:rPr>
+          <w:rFonts w:asciiTheme="minorEastAsia" w:eastAsiaTheme="minorEastAsia" w:hAnsiTheme="minorEastAsia" w:cs="굴림" w:hint="eastAsia"/>
+          <w:bCs/>
+          <w:color w:val="auto"/>
+          <w:sz w:val="22"/>
+          <w:szCs w:val="22"/>
+          <w:highlight w:val="yellow"/>
+        </w:rPr>
+        <w:t>브랜디드</w:t>
+      </w:r>
+      <w:proofErr w:type="spellEnd"/>
+      <w:r>
+        <w:rPr>
+          <w:rFonts w:asciiTheme="minorEastAsia" w:eastAsiaTheme="minorEastAsia" w:hAnsiTheme="minorEastAsia" w:cs="굴림" w:hint="eastAsia"/>
           <w:bCs/>
           <w:color w:val="auto"/>
           <w:sz w:val="22"/>
@@ -2061,104 +2118,53 @@
         </w:rPr>
         <w:t xml:space="preserve"> </w:t>
       </w:r>
-      <w:r>
-        <w:rPr>
-          <w:rFonts w:asciiTheme="minorEastAsia" w:eastAsiaTheme="minorEastAsia" w:hAnsiTheme="minorEastAsia" w:cs="굴림" w:hint="eastAsia"/>
-          <w:bCs/>
-          <w:color w:val="auto"/>
-          <w:sz w:val="22"/>
-          <w:szCs w:val="22"/>
-          <w:highlight w:val="yellow"/>
-        </w:rPr>
-        <w:t>클립</w:t>
-      </w:r>
-      <w:r>
-        <w:rPr>
-          <w:rFonts w:asciiTheme="minorEastAsia" w:eastAsiaTheme="minorEastAsia" w:hAnsiTheme="minorEastAsia" w:cs="굴림"/>
-          <w:bCs/>
-          <w:color w:val="auto"/>
-          <w:sz w:val="22"/>
-          <w:szCs w:val="22"/>
-          <w:highlight w:val="yellow"/>
-        </w:rPr>
-        <w:t>ID : “SBS”</w:t>
-      </w:r>
-      <w:r>
-        <w:rPr>
-          <w:rFonts w:asciiTheme="minorEastAsia" w:eastAsiaTheme="minorEastAsia" w:hAnsiTheme="minorEastAsia" w:cs="굴림" w:hint="eastAsia"/>
-          <w:bCs/>
-          <w:color w:val="auto"/>
-          <w:sz w:val="22"/>
-          <w:szCs w:val="22"/>
-          <w:highlight w:val="yellow"/>
-        </w:rPr>
-        <w:t xml:space="preserve"> 유튜브 채널에 업로드 되는 특정 클립의 </w:t>
-      </w:r>
-      <w:r>
-        <w:rPr>
-          <w:rFonts w:asciiTheme="minorEastAsia" w:eastAsiaTheme="minorEastAsia" w:hAnsiTheme="minorEastAsia" w:cs="굴림"/>
-          <w:bCs/>
-          <w:color w:val="auto"/>
-          <w:sz w:val="22"/>
-          <w:szCs w:val="22"/>
-          <w:highlight w:val="yellow"/>
-        </w:rPr>
-        <w:t>ID</w:t>
-      </w:r>
-      <w:r>
-        <w:rPr>
-          <w:rFonts w:asciiTheme="minorEastAsia" w:eastAsiaTheme="minorEastAsia" w:hAnsiTheme="minorEastAsia" w:cs="굴림" w:hint="eastAsia"/>
-          <w:bCs/>
-          <w:color w:val="auto"/>
-          <w:sz w:val="22"/>
-          <w:szCs w:val="22"/>
-          <w:highlight w:val="yellow"/>
-        </w:rPr>
-        <w:t xml:space="preserve">에 </w:t>
-      </w:r>
-      <w:r>
-        <w:rPr>
-          <w:rFonts w:asciiTheme="minorEastAsia" w:eastAsiaTheme="minorEastAsia" w:hAnsiTheme="minorEastAsia" w:cs="굴림"/>
-          <w:bCs/>
-          <w:color w:val="auto"/>
-          <w:sz w:val="22"/>
-          <w:szCs w:val="22"/>
-          <w:highlight w:val="yellow"/>
-        </w:rPr>
-        <w:t>“</w:t>
-      </w:r>
-      <w:r>
-        <w:rPr>
-          <w:rFonts w:asciiTheme="minorEastAsia" w:eastAsiaTheme="minorEastAsia" w:hAnsiTheme="minorEastAsia" w:cs="굴림" w:hint="eastAsia"/>
-          <w:bCs/>
-          <w:color w:val="auto"/>
-          <w:sz w:val="22"/>
-          <w:szCs w:val="22"/>
-          <w:highlight w:val="yellow"/>
-        </w:rPr>
-        <w:t>광고주</w:t>
-      </w:r>
-      <w:r>
-        <w:rPr>
-          <w:rFonts w:asciiTheme="minorEastAsia" w:eastAsiaTheme="minorEastAsia" w:hAnsiTheme="minorEastAsia" w:cs="굴림"/>
-          <w:bCs/>
-          <w:color w:val="auto"/>
-          <w:sz w:val="22"/>
-          <w:szCs w:val="22"/>
-          <w:highlight w:val="yellow"/>
-        </w:rPr>
-        <w:t xml:space="preserve">” </w:t>
-      </w:r>
-      <w:r>
-        <w:rPr>
-          <w:rFonts w:asciiTheme="minorEastAsia" w:eastAsiaTheme="minorEastAsia" w:hAnsiTheme="minorEastAsia" w:cs="굴림" w:hint="eastAsia"/>
-          <w:bCs/>
-          <w:color w:val="auto"/>
-          <w:sz w:val="22"/>
-          <w:szCs w:val="22"/>
-          <w:highlight w:val="yellow"/>
-        </w:rPr>
-        <w:t>브랜드 협찬을 고지하는 유형의 디지털 협찬을 의미한다.</w:t>
+      <w:proofErr w:type="gramStart"/>
+      <w:r>
+        <w:rPr>
+          <w:rFonts w:asciiTheme="minorEastAsia" w:eastAsiaTheme="minorEastAsia" w:hAnsiTheme="minorEastAsia" w:cs="굴림" w:hint="eastAsia"/>
+          <w:bCs/>
+          <w:color w:val="auto"/>
+          <w:sz w:val="22"/>
+          <w:szCs w:val="22"/>
+          <w:highlight w:val="yellow"/>
+        </w:rPr>
+        <w:t xml:space="preserve">콘텐츠 </w:t>
+      </w:r>
+      <w:r>
+        <w:rPr>
+          <w:rFonts w:asciiTheme="minorEastAsia" w:eastAsiaTheme="minorEastAsia" w:hAnsiTheme="minorEastAsia" w:cs="굴림"/>
+          <w:bCs/>
+          <w:color w:val="auto"/>
+          <w:sz w:val="22"/>
+          <w:szCs w:val="22"/>
+          <w:highlight w:val="yellow"/>
+        </w:rPr>
+        <w:t>:</w:t>
+      </w:r>
+      <w:proofErr w:type="gramEnd"/>
+      <w:r>
+        <w:rPr>
+          <w:rFonts w:asciiTheme="minorEastAsia" w:eastAsiaTheme="minorEastAsia" w:hAnsiTheme="minorEastAsia" w:cs="굴림" w:hint="eastAsia"/>
+          <w:bCs/>
+          <w:color w:val="auto"/>
+          <w:spacing w:val="-2"/>
+          <w:sz w:val="22"/>
+          <w:szCs w:val="22"/>
+          <w:highlight w:val="yellow"/>
+        </w:rPr>
+        <w:t xml:space="preserve"> </w:t>
+      </w:r>
+      <w:r>
+        <w:rPr>
+          <w:rFonts w:asciiTheme="minorEastAsia" w:eastAsiaTheme="minorEastAsia" w:hAnsiTheme="minorEastAsia" w:cs="굴림" w:hint="eastAsia"/>
+          <w:bCs/>
+          <w:color w:val="auto"/>
+          <w:spacing w:val="-2"/>
+          <w:sz w:val="22"/>
+          <w:szCs w:val="22"/>
+          <w:highlight w:val="yellow"/>
+        </w:rPr>
+        <w:t>브랜드 맞춤 디지털 콘텐츠를 별도로 제작 및 업로드하는 협찬을 의미한다.</w:t>
       </w:r>
     </w:p>
     <w:p>
@@ -2183,40 +2189,110 @@
           <w:szCs w:val="22"/>
           <w:highlight w:val="yellow"/>
         </w:rPr>
-        <w:t>4. SMR</w:t>
-      </w:r>
-      <w:r>
-        <w:rPr>
-          <w:rFonts w:asciiTheme="minorEastAsia" w:eastAsiaTheme="minorEastAsia" w:hAnsiTheme="minorEastAsia" w:cs="굴림" w:hint="eastAsia"/>
-          <w:bCs/>
-          <w:color w:val="auto"/>
-          <w:sz w:val="22"/>
-          <w:szCs w:val="22"/>
-          <w:highlight w:val="yellow"/>
-        </w:rPr>
-        <w:t xml:space="preserve"> 클립 업로드 </w:t>
-      </w:r>
-      <w:r>
-        <w:rPr>
-          <w:rFonts w:asciiTheme="minorEastAsia" w:eastAsiaTheme="minorEastAsia" w:hAnsiTheme="minorEastAsia" w:cs="굴림"/>
-          <w:bCs/>
-          <w:color w:val="auto"/>
-          <w:sz w:val="22"/>
-          <w:szCs w:val="22"/>
-          <w:highlight w:val="yellow"/>
-        </w:rPr>
-        <w:t xml:space="preserve">: “SBS” SMR </w:t>
-      </w:r>
-      <w:r>
-        <w:rPr>
-          <w:rFonts w:asciiTheme="minorEastAsia" w:eastAsiaTheme="minorEastAsia" w:hAnsiTheme="minorEastAsia" w:cs="굴림" w:hint="eastAsia"/>
-          <w:bCs/>
-          <w:color w:val="auto"/>
-          <w:sz w:val="22"/>
-          <w:szCs w:val="22"/>
-          <w:highlight w:val="yellow"/>
-        </w:rPr>
-        <w:t xml:space="preserve">채널에 </w:t>
+        <w:t xml:space="preserve">3. </w:t>
+      </w:r>
+      <w:r>
+        <w:rPr>
+          <w:rFonts w:asciiTheme="minorEastAsia" w:eastAsiaTheme="minorEastAsia" w:hAnsiTheme="minorEastAsia" w:cs="굴림" w:hint="eastAsia"/>
+          <w:bCs/>
+          <w:color w:val="auto"/>
+          <w:sz w:val="22"/>
+          <w:szCs w:val="22"/>
+          <w:highlight w:val="yellow"/>
+        </w:rPr>
+        <w:t xml:space="preserve">유튜브 </w:t>
+      </w:r>
+      <w:proofErr w:type="spellStart"/>
+      <w:r>
+        <w:rPr>
+          <w:rFonts w:asciiTheme="minorEastAsia" w:eastAsiaTheme="minorEastAsia" w:hAnsiTheme="minorEastAsia" w:cs="굴림" w:hint="eastAsia"/>
+          <w:bCs/>
+          <w:color w:val="auto"/>
+          <w:sz w:val="22"/>
+          <w:szCs w:val="22"/>
+          <w:highlight w:val="yellow"/>
+        </w:rPr>
+        <w:t>브랜디드</w:t>
+      </w:r>
+      <w:proofErr w:type="spellEnd"/>
+      <w:r>
+        <w:rPr>
+          <w:rFonts w:asciiTheme="minorEastAsia" w:eastAsiaTheme="minorEastAsia" w:hAnsiTheme="minorEastAsia" w:cs="굴림"/>
+          <w:bCs/>
+          <w:color w:val="auto"/>
+          <w:sz w:val="22"/>
+          <w:szCs w:val="22"/>
+          <w:highlight w:val="yellow"/>
+        </w:rPr>
+        <w:t xml:space="preserve"> </w:t>
+      </w:r>
+      <w:r>
+        <w:rPr>
+          <w:rFonts w:asciiTheme="minorEastAsia" w:eastAsiaTheme="minorEastAsia" w:hAnsiTheme="minorEastAsia" w:cs="굴림" w:hint="eastAsia"/>
+          <w:bCs/>
+          <w:color w:val="auto"/>
+          <w:sz w:val="22"/>
+          <w:szCs w:val="22"/>
+          <w:highlight w:val="yellow"/>
+        </w:rPr>
+        <w:t>클립</w:t>
+      </w:r>
+      <w:proofErr w:type="gramStart"/>
+      <w:r>
+        <w:rPr>
+          <w:rFonts w:asciiTheme="minorEastAsia" w:eastAsiaTheme="minorEastAsia" w:hAnsiTheme="minorEastAsia" w:cs="굴림"/>
+          <w:bCs/>
+          <w:color w:val="auto"/>
+          <w:sz w:val="22"/>
+          <w:szCs w:val="22"/>
+          <w:highlight w:val="yellow"/>
+        </w:rPr>
+        <w:t>ID :</w:t>
+      </w:r>
+      <w:proofErr w:type="gramEnd"/>
+      <w:r>
+        <w:rPr>
+          <w:rFonts w:asciiTheme="minorEastAsia" w:eastAsiaTheme="minorEastAsia" w:hAnsiTheme="minorEastAsia" w:cs="굴림"/>
+          <w:bCs/>
+          <w:color w:val="auto"/>
+          <w:sz w:val="22"/>
+          <w:szCs w:val="22"/>
+          <w:highlight w:val="yellow"/>
+        </w:rPr>
+        <w:t xml:space="preserve"> “SBS”</w:t>
+      </w:r>
+      <w:r>
+        <w:rPr>
+          <w:rFonts w:asciiTheme="minorEastAsia" w:eastAsiaTheme="minorEastAsia" w:hAnsiTheme="minorEastAsia" w:cs="굴림" w:hint="eastAsia"/>
+          <w:bCs/>
+          <w:color w:val="auto"/>
+          <w:sz w:val="22"/>
+          <w:szCs w:val="22"/>
+          <w:highlight w:val="yellow"/>
+        </w:rPr>
+        <w:t xml:space="preserve"> 유튜브 채널에 업로드 되는 특정 클립의 </w:t>
+      </w:r>
+      <w:r>
+        <w:rPr>
+          <w:rFonts w:asciiTheme="minorEastAsia" w:eastAsiaTheme="minorEastAsia" w:hAnsiTheme="minorEastAsia" w:cs="굴림"/>
+          <w:bCs/>
+          <w:color w:val="auto"/>
+          <w:sz w:val="22"/>
+          <w:szCs w:val="22"/>
+          <w:highlight w:val="yellow"/>
+        </w:rPr>
+        <w:t>ID</w:t>
+      </w:r>
+      <w:r>
+        <w:rPr>
+          <w:rFonts w:asciiTheme="minorEastAsia" w:eastAsiaTheme="minorEastAsia" w:hAnsiTheme="minorEastAsia" w:cs="굴림" w:hint="eastAsia"/>
+          <w:bCs/>
+          <w:color w:val="auto"/>
+          <w:sz w:val="22"/>
+          <w:szCs w:val="22"/>
+          <w:highlight w:val="yellow"/>
+        </w:rPr>
+        <w:t xml:space="preserve">에 </w:t>
       </w:r>
       <w:r>
         <w:rPr>
@@ -2238,29 +2314,29 @@
           <w:szCs w:val="22"/>
           <w:highlight w:val="yellow"/>
         </w:rPr>
-        <w:t>프로그램</w:t>
-      </w:r>
-      <w:r>
-        <w:rPr>
-          <w:rFonts w:asciiTheme="minorEastAsia" w:eastAsiaTheme="minorEastAsia" w:hAnsiTheme="minorEastAsia" w:cs="굴림"/>
-          <w:bCs/>
-          <w:color w:val="auto"/>
-          <w:sz w:val="22"/>
-          <w:szCs w:val="22"/>
-          <w:highlight w:val="yellow"/>
-        </w:rPr>
-        <w:t>”</w:t>
-      </w:r>
-      <w:r>
-        <w:rPr>
-          <w:rFonts w:asciiTheme="minorEastAsia" w:eastAsiaTheme="minorEastAsia" w:hAnsiTheme="minorEastAsia" w:cs="굴림" w:hint="eastAsia"/>
-          <w:bCs/>
-          <w:color w:val="auto"/>
-          <w:sz w:val="22"/>
-          <w:szCs w:val="22"/>
-          <w:highlight w:val="yellow"/>
-        </w:rPr>
-        <w:t xml:space="preserve"> 방송 클립 업로드를 의미한다.</w:t>
+        <w:t>광고주</w:t>
+      </w:r>
+      <w:r>
+        <w:rPr>
+          <w:rFonts w:asciiTheme="minorEastAsia" w:eastAsiaTheme="minorEastAsia" w:hAnsiTheme="minorEastAsia" w:cs="굴림"/>
+          <w:bCs/>
+          <w:color w:val="auto"/>
+          <w:sz w:val="22"/>
+          <w:szCs w:val="22"/>
+          <w:highlight w:val="yellow"/>
+        </w:rPr>
+        <w:t xml:space="preserve">” </w:t>
+      </w:r>
+      <w:r>
+        <w:rPr>
+          <w:rFonts w:asciiTheme="minorEastAsia" w:eastAsiaTheme="minorEastAsia" w:hAnsiTheme="minorEastAsia" w:cs="굴림" w:hint="eastAsia"/>
+          <w:bCs/>
+          <w:color w:val="auto"/>
+          <w:sz w:val="22"/>
+          <w:szCs w:val="22"/>
+          <w:highlight w:val="yellow"/>
+        </w:rPr>
+        <w:t>브랜드 협찬을 고지하는 유형의 디지털 협찬을 의미한다.</w:t>
       </w:r>
     </w:p>
     <w:p>
@@ -2273,6 +2349,132 @@
           <w:color w:val="auto"/>
           <w:sz w:val="22"/>
           <w:szCs w:val="22"/>
+          <w:highlight w:val="yellow"/>
+        </w:rPr>
+      </w:pPr>
+      <w:r>
+        <w:rPr>
+          <w:rFonts w:asciiTheme="minorEastAsia" w:eastAsiaTheme="minorEastAsia" w:hAnsiTheme="minorEastAsia" w:cs="굴림"/>
+          <w:bCs/>
+          <w:color w:val="auto"/>
+          <w:sz w:val="22"/>
+          <w:szCs w:val="22"/>
+          <w:highlight w:val="yellow"/>
+        </w:rPr>
+        <w:t>4. SMR</w:t>
+      </w:r>
+      <w:r>
+        <w:rPr>
+          <w:rFonts w:asciiTheme="minorEastAsia" w:eastAsiaTheme="minorEastAsia" w:hAnsiTheme="minorEastAsia" w:cs="굴림" w:hint="eastAsia"/>
+          <w:bCs/>
+          <w:color w:val="auto"/>
+          <w:sz w:val="22"/>
+          <w:szCs w:val="22"/>
+          <w:highlight w:val="yellow"/>
+        </w:rPr>
+        <w:t xml:space="preserve"> 클립 </w:t>
+      </w:r>
+      <w:proofErr w:type="gramStart"/>
+      <w:r>
+        <w:rPr>
+          <w:rFonts w:asciiTheme="minorEastAsia" w:eastAsiaTheme="minorEastAsia" w:hAnsiTheme="minorEastAsia" w:cs="굴림" w:hint="eastAsia"/>
+          <w:bCs/>
+          <w:color w:val="auto"/>
+          <w:sz w:val="22"/>
+          <w:szCs w:val="22"/>
+          <w:highlight w:val="yellow"/>
+        </w:rPr>
+        <w:t xml:space="preserve">업로드 </w:t>
+      </w:r>
+      <w:r>
+        <w:rPr>
+          <w:rFonts w:asciiTheme="minorEastAsia" w:eastAsiaTheme="minorEastAsia" w:hAnsiTheme="minorEastAsia" w:cs="굴림"/>
+          <w:bCs/>
+          <w:color w:val="auto"/>
+          <w:sz w:val="22"/>
+          <w:szCs w:val="22"/>
+          <w:highlight w:val="yellow"/>
+        </w:rPr>
+        <w:t>:</w:t>
+      </w:r>
+      <w:proofErr w:type="gramEnd"/>
+      <w:r>
+        <w:rPr>
+          <w:rFonts w:asciiTheme="minorEastAsia" w:eastAsiaTheme="minorEastAsia" w:hAnsiTheme="minorEastAsia" w:cs="굴림"/>
+          <w:bCs/>
+          <w:color w:val="auto"/>
+          <w:sz w:val="22"/>
+          <w:szCs w:val="22"/>
+          <w:highlight w:val="yellow"/>
+        </w:rPr>
+        <w:t xml:space="preserve"> “SBS” SMR </w:t>
+      </w:r>
+      <w:r>
+        <w:rPr>
+          <w:rFonts w:asciiTheme="minorEastAsia" w:eastAsiaTheme="minorEastAsia" w:hAnsiTheme="minorEastAsia" w:cs="굴림" w:hint="eastAsia"/>
+          <w:bCs/>
+          <w:color w:val="auto"/>
+          <w:sz w:val="22"/>
+          <w:szCs w:val="22"/>
+          <w:highlight w:val="yellow"/>
+        </w:rPr>
+        <w:t xml:space="preserve">채널에 </w:t>
+      </w:r>
+      <w:r>
+        <w:rPr>
+          <w:rFonts w:asciiTheme="minorEastAsia" w:eastAsiaTheme="minorEastAsia" w:hAnsiTheme="minorEastAsia" w:cs="굴림"/>
+          <w:bCs/>
+          <w:color w:val="auto"/>
+          <w:sz w:val="22"/>
+          <w:szCs w:val="22"/>
+          <w:highlight w:val="yellow"/>
+        </w:rPr>
+        <w:t>“</w:t>
+      </w:r>
+      <w:r>
+        <w:rPr>
+          <w:rFonts w:asciiTheme="minorEastAsia" w:eastAsiaTheme="minorEastAsia" w:hAnsiTheme="minorEastAsia" w:cs="굴림" w:hint="eastAsia"/>
+          <w:bCs/>
+          <w:color w:val="auto"/>
+          <w:sz w:val="22"/>
+          <w:szCs w:val="22"/>
+          <w:highlight w:val="yellow"/>
+        </w:rPr>
+        <w:t>프로그램</w:t>
+      </w:r>
+      <w:r>
+        <w:rPr>
+          <w:rFonts w:asciiTheme="minorEastAsia" w:eastAsiaTheme="minorEastAsia" w:hAnsiTheme="minorEastAsia" w:cs="굴림"/>
+          <w:bCs/>
+          <w:color w:val="auto"/>
+          <w:sz w:val="22"/>
+          <w:szCs w:val="22"/>
+          <w:highlight w:val="yellow"/>
+        </w:rPr>
+        <w:t>”</w:t>
+      </w:r>
+      <w:r>
+        <w:rPr>
+          <w:rFonts w:asciiTheme="minorEastAsia" w:eastAsiaTheme="minorEastAsia" w:hAnsiTheme="minorEastAsia" w:cs="굴림" w:hint="eastAsia"/>
+          <w:bCs/>
+          <w:color w:val="auto"/>
+          <w:sz w:val="22"/>
+          <w:szCs w:val="22"/>
+          <w:highlight w:val="yellow"/>
+        </w:rPr>
+        <w:t xml:space="preserve"> 방송 클립 업로드를 의미한다.</w:t>
+      </w:r>
+    </w:p>
+    <w:p>
+      <w:pPr>
+        <w:pStyle w:val="a6"/>
+        <w:spacing w:line="240" w:lineRule="auto"/>
+        <w:rPr>
+          <w:rFonts w:asciiTheme="minorEastAsia" w:eastAsiaTheme="minorEastAsia" w:hAnsiTheme="minorEastAsia" w:cs="굴림"/>
+          <w:bCs/>
+          <w:color w:val="auto"/>
+          <w:sz w:val="22"/>
+          <w:szCs w:val="22"/>
         </w:rPr>
       </w:pPr>
       <w:r>
@@ -2295,18 +2497,42 @@
           <w:szCs w:val="22"/>
           <w:highlight w:val="yellow"/>
         </w:rPr>
-        <w:t xml:space="preserve">라이선스 패키지 </w:t>
-      </w:r>
-      <w:r>
-        <w:rPr>
-          <w:rFonts w:asciiTheme="minorEastAsia" w:eastAsiaTheme="minorEastAsia" w:hAnsiTheme="minorEastAsia" w:cs="굴림"/>
-          <w:bCs/>
-          <w:color w:val="auto"/>
-          <w:sz w:val="22"/>
-          <w:szCs w:val="22"/>
-          <w:highlight w:val="yellow"/>
-        </w:rPr>
-        <w:t xml:space="preserve">: </w:t>
+        <w:t xml:space="preserve">라이선스 </w:t>
+      </w:r>
+      <w:proofErr w:type="gramStart"/>
+      <w:r>
+        <w:rPr>
+          <w:rFonts w:asciiTheme="minorEastAsia" w:eastAsiaTheme="minorEastAsia" w:hAnsiTheme="minorEastAsia" w:cs="굴림" w:hint="eastAsia"/>
+          <w:bCs/>
+          <w:color w:val="auto"/>
+          <w:sz w:val="22"/>
+          <w:szCs w:val="22"/>
+          <w:highlight w:val="yellow"/>
+        </w:rPr>
+        <w:t xml:space="preserve">패키지 </w:t>
+      </w:r>
+      <w:r>
+        <w:rPr>
+          <w:rFonts w:asciiTheme="minorEastAsia" w:eastAsiaTheme="minorEastAsia" w:hAnsiTheme="minorEastAsia" w:cs="굴림"/>
+          <w:bCs/>
+          <w:color w:val="auto"/>
+          <w:sz w:val="22"/>
+          <w:szCs w:val="22"/>
+          <w:highlight w:val="yellow"/>
+        </w:rPr>
+        <w:t>:</w:t>
+      </w:r>
+      <w:proofErr w:type="gramEnd"/>
+      <w:r>
+        <w:rPr>
+          <w:rFonts w:asciiTheme="minorEastAsia" w:eastAsiaTheme="minorEastAsia" w:hAnsiTheme="minorEastAsia" w:cs="굴림"/>
+          <w:bCs/>
+          <w:color w:val="auto"/>
+          <w:sz w:val="22"/>
+          <w:szCs w:val="22"/>
+          <w:highlight w:val="yellow"/>
+        </w:rPr>
+        <w:t xml:space="preserve"> </w:t>
       </w:r>
       <w:r>
         <w:rPr>
@@ -2392,6 +2618,7 @@
         </w:rPr>
         <w:t xml:space="preserve"> </w:t>
       </w:r>
+      <w:proofErr w:type="spellStart"/>
       <w:r>
         <w:rPr>
           <w:rFonts w:asciiTheme="minorEastAsia" w:eastAsiaTheme="minorEastAsia" w:hAnsiTheme="minorEastAsia" w:cs="굴림" w:hint="eastAsia"/>
@@ -2402,7 +2629,20 @@
           <w:szCs w:val="22"/>
           <w:highlight w:val="yellow"/>
         </w:rPr>
-        <w:t>제작협찬,</w:t>
+        <w:t>제작협찬</w:t>
+      </w:r>
+      <w:proofErr w:type="spellEnd"/>
+      <w:r>
+        <w:rPr>
+          <w:rFonts w:asciiTheme="minorEastAsia" w:eastAsiaTheme="minorEastAsia" w:hAnsiTheme="minorEastAsia" w:cs="굴림" w:hint="eastAsia"/>
+          <w:bCs/>
+          <w:color w:val="auto"/>
+          <w:spacing w:val="2"/>
+          <w:sz w:val="22"/>
+          <w:szCs w:val="22"/>
+          <w:highlight w:val="yellow"/>
+        </w:rPr>
+        <w:t>,</w:t>
       </w:r>
       <w:r>
         <w:rPr>
@@ -2508,15 +2748,27 @@
           <w:szCs w:val="22"/>
         </w:rPr>
       </w:pPr>
-      <w:r>
-        <w:rPr>
-          <w:rFonts w:asciiTheme="minorEastAsia" w:eastAsiaTheme="minorEastAsia" w:hAnsiTheme="minorEastAsia" w:cs="굴림" w:hint="eastAsia"/>
-          <w:b/>
-          <w:bCs/>
-          <w:sz w:val="22"/>
-          <w:szCs w:val="22"/>
-        </w:rPr>
-        <w:t>제 4조 (프로그램의 개요)</w:t>
+      <w:proofErr w:type="gramStart"/>
+      <w:r>
+        <w:rPr>
+          <w:rFonts w:asciiTheme="minorEastAsia" w:eastAsiaTheme="minorEastAsia" w:hAnsiTheme="minorEastAsia" w:cs="굴림" w:hint="eastAsia"/>
+          <w:b/>
+          <w:bCs/>
+          <w:sz w:val="22"/>
+          <w:szCs w:val="22"/>
+        </w:rPr>
+        <w:t>제 4</w:t>
+      </w:r>
+      <w:proofErr w:type="gramEnd"/>
+      <w:r>
+        <w:rPr>
+          <w:rFonts w:asciiTheme="minorEastAsia" w:eastAsiaTheme="minorEastAsia" w:hAnsiTheme="minorEastAsia" w:cs="굴림" w:hint="eastAsia"/>
+          <w:b/>
+          <w:bCs/>
+          <w:sz w:val="22"/>
+          <w:szCs w:val="22"/>
+        </w:rPr>
+        <w:t>조 (프로그램의 개요)</w:t>
       </w:r>
     </w:p>
     <w:p>
@@ -2537,6 +2789,7 @@
         </w:rPr>
         <w:t>“SBS”가 “</w:t>
       </w:r>
+      <w:proofErr w:type="spellStart"/>
       <w:r>
         <w:rPr>
           <w:rFonts w:asciiTheme="minorEastAsia" w:eastAsiaTheme="minorEastAsia" w:hAnsiTheme="minorEastAsia" w:cs="굴림" w:hint="eastAsia"/>
@@ -2551,7 +2804,16 @@
           <w:sz w:val="22"/>
           <w:szCs w:val="22"/>
         </w:rPr>
-        <w:t xml:space="preserve">”에게 판매하는 마케팅 라이선스 패키지 대상 </w:t>
+        <w:t>”에게</w:t>
+      </w:r>
+      <w:proofErr w:type="spellEnd"/>
+      <w:r>
+        <w:rPr>
+          <w:rFonts w:asciiTheme="minorEastAsia" w:eastAsiaTheme="minorEastAsia" w:hAnsiTheme="minorEastAsia" w:cs="굴림" w:hint="eastAsia"/>
+          <w:sz w:val="22"/>
+          <w:szCs w:val="22"/>
+        </w:rPr>
+        <w:t xml:space="preserve"> 판매하는 마케팅 라이선스 패키지 대상 </w:t>
       </w:r>
       <w:r>
         <w:rPr>
@@ -2852,6 +3114,7 @@
           <w:sz w:val="22"/>
           <w:szCs w:val="22"/>
         </w:rPr>
+        <w:lastRenderedPageBreak/>
         <w:t xml:space="preserve"> </w:t>
       </w:r>
       <w:r>
@@ -2894,6 +3157,7 @@
         </w:rPr>
         <w:t xml:space="preserve"> “</w:t>
       </w:r>
+      <w:proofErr w:type="spellStart"/>
       <w:r>
         <w:rPr>
           <w:rFonts w:asciiTheme="minorEastAsia" w:eastAsiaTheme="minorEastAsia" w:hAnsiTheme="minorEastAsia" w:cs="굴림" w:hint="eastAsia"/>
@@ -2908,7 +3172,16 @@
           <w:sz w:val="22"/>
           <w:szCs w:val="22"/>
         </w:rPr>
-        <w:t>”에게 사전에 통지한다.</w:t>
+        <w:t>”에게</w:t>
+      </w:r>
+      <w:proofErr w:type="spellEnd"/>
+      <w:r>
+        <w:rPr>
+          <w:rFonts w:asciiTheme="minorEastAsia" w:eastAsiaTheme="minorEastAsia" w:hAnsiTheme="minorEastAsia" w:cs="굴림" w:hint="eastAsia"/>
+          <w:sz w:val="22"/>
+          <w:szCs w:val="22"/>
+        </w:rPr>
+        <w:t xml:space="preserve"> 사전에 통지한다.</w:t>
       </w:r>
     </w:p>
     <w:p>
@@ -2934,15 +3207,27 @@
           <w:highlight w:val="yellow"/>
         </w:rPr>
       </w:pPr>
-      <w:r>
-        <w:rPr>
-          <w:rFonts w:asciiTheme="minorEastAsia" w:eastAsiaTheme="minorEastAsia" w:hAnsiTheme="minorEastAsia" w:cs="굴림" w:hint="eastAsia"/>
-          <w:b/>
-          <w:sz w:val="22"/>
-          <w:szCs w:val="22"/>
-          <w:highlight w:val="yellow"/>
-        </w:rPr>
-        <w:t>제 5 조 (마케팅 라이선스 패키지)</w:t>
+      <w:proofErr w:type="gramStart"/>
+      <w:r>
+        <w:rPr>
+          <w:rFonts w:asciiTheme="minorEastAsia" w:eastAsiaTheme="minorEastAsia" w:hAnsiTheme="minorEastAsia" w:cs="굴림" w:hint="eastAsia"/>
+          <w:b/>
+          <w:sz w:val="22"/>
+          <w:szCs w:val="22"/>
+          <w:highlight w:val="yellow"/>
+        </w:rPr>
+        <w:t>제 5</w:t>
+      </w:r>
+      <w:proofErr w:type="gramEnd"/>
+      <w:r>
+        <w:rPr>
+          <w:rFonts w:asciiTheme="minorEastAsia" w:eastAsiaTheme="minorEastAsia" w:hAnsiTheme="minorEastAsia" w:cs="굴림" w:hint="eastAsia"/>
+          <w:b/>
+          <w:sz w:val="22"/>
+          <w:szCs w:val="22"/>
+          <w:highlight w:val="yellow"/>
+        </w:rPr>
+        <w:t xml:space="preserve"> 조 (마케팅 라이선스 패키지)</w:t>
       </w:r>
     </w:p>
     <w:p>
@@ -2964,17 +3249,38 @@
           <w:szCs w:val="22"/>
           <w:highlight w:val="yellow"/>
         </w:rPr>
-        <w:t xml:space="preserve">“광고주”를 대행하는 </w:t>
-      </w:r>
-      <w:r>
-        <w:rPr>
-          <w:rFonts w:asciiTheme="minorEastAsia" w:eastAsiaTheme="minorEastAsia" w:hAnsiTheme="minorEastAsia" w:cs="굴림"/>
-          <w:sz w:val="22"/>
-          <w:szCs w:val="22"/>
-          <w:highlight w:val="yellow"/>
-        </w:rPr>
         <w:t>“</w:t>
       </w:r>
+      <w:proofErr w:type="spellStart"/>
+      <w:r>
+        <w:rPr>
+          <w:rFonts w:asciiTheme="minorEastAsia" w:eastAsiaTheme="minorEastAsia" w:hAnsiTheme="minorEastAsia" w:cs="굴림" w:hint="eastAsia"/>
+          <w:sz w:val="22"/>
+          <w:szCs w:val="22"/>
+          <w:highlight w:val="yellow"/>
+        </w:rPr>
+        <w:t>광고주”를</w:t>
+      </w:r>
+      <w:proofErr w:type="spellEnd"/>
+      <w:r>
+        <w:rPr>
+          <w:rFonts w:asciiTheme="minorEastAsia" w:eastAsiaTheme="minorEastAsia" w:hAnsiTheme="minorEastAsia" w:cs="굴림" w:hint="eastAsia"/>
+          <w:sz w:val="22"/>
+          <w:szCs w:val="22"/>
+          <w:highlight w:val="yellow"/>
+        </w:rPr>
+        <w:t xml:space="preserve"> 대행하는 </w:t>
+      </w:r>
+      <w:r>
+        <w:rPr>
+          <w:rFonts w:asciiTheme="minorEastAsia" w:eastAsiaTheme="minorEastAsia" w:hAnsiTheme="minorEastAsia" w:cs="굴림"/>
+          <w:sz w:val="22"/>
+          <w:szCs w:val="22"/>
+          <w:highlight w:val="yellow"/>
+        </w:rPr>
+        <w:t>“</w:t>
+      </w:r>
+      <w:proofErr w:type="spellStart"/>
       <w:r>
         <w:rPr>
           <w:rFonts w:asciiTheme="minorEastAsia" w:eastAsiaTheme="minorEastAsia" w:hAnsiTheme="minorEastAsia" w:cs="굴림" w:hint="eastAsia"/>
@@ -2984,6 +3290,7 @@
         </w:rPr>
         <w:t>미디어렙</w:t>
       </w:r>
+      <w:proofErr w:type="spellEnd"/>
       <w:r>
         <w:rPr>
           <w:rFonts w:asciiTheme="minorEastAsia" w:eastAsiaTheme="minorEastAsia" w:hAnsiTheme="minorEastAsia" w:cs="굴림"/>
@@ -3226,14 +3533,14 @@
             <w:pPr>
               <w:pStyle w:val="a6"/>
               <w:spacing w:line="276" w:lineRule="auto"/>
-              <w:jc w:val="center"/>
+              <w:ind w:firstLineChars="100" w:firstLine="200"/>
+              <w:jc w:val="both"/>
               <w:rPr>
                 <w:rFonts w:asciiTheme="minorEastAsia" w:eastAsiaTheme="minorEastAsia" w:hAnsiTheme="minorEastAsia" w:cs="굴림"/>
                 <w:color w:val="auto"/>
                 <w:highlight w:val="yellow"/>
               </w:rPr>
             </w:pPr>
-            <w:commentRangeStart w:id="1"/>
             <w:r>
               <w:rPr>
                 <w:rFonts w:asciiTheme="minorEastAsia" w:eastAsiaTheme="minorEastAsia" w:hAnsiTheme="minorEastAsia" w:cs="굴림" w:hint="eastAsia"/>
@@ -3264,19 +3571,15 @@
                 <w:color w:val="auto"/>
                 <w:highlight w:val="yellow"/>
               </w:rPr>
-              <w:t>,000,000 (금 억천백만원)</w:t>
+              <w:t>,000,000 (금 억천백만</w:t>
             </w:r>
-            <w:commentRangeEnd w:id="1"/>
             <w:r>
               <w:rPr>
-                <w:rStyle w:val="a7"/>
-                <w:rFonts w:asciiTheme="minorEastAsia" w:eastAsiaTheme="minorEastAsia" w:hAnsiTheme="minorEastAsia" w:cs="굴림"/>
+                <w:rFonts w:asciiTheme="minorEastAsia" w:eastAsiaTheme="minorEastAsia" w:hAnsiTheme="minorEastAsia" w:cs="굴림" w:hint="eastAsia"/>
                 <w:color w:val="auto"/>
-                <w:sz w:val="20"/>
-                <w:szCs w:val="20"/>
-                <w:highlight w:val="yellow"/>
-              </w:rPr>
-              <w:commentReference w:id="1"/>
+                <w:highlight w:val="yellow"/>
+              </w:rPr>
+              <w:t>)</w:t>
             </w:r>
           </w:p>
         </w:tc>
@@ -3431,6 +3734,7 @@
               </w:rPr>
               <w:t xml:space="preserve"> </w:t>
             </w:r>
+            <w:proofErr w:type="spellStart"/>
             <w:r>
               <w:rPr>
                 <w:rFonts w:asciiTheme="minorEastAsia" w:eastAsiaTheme="minorEastAsia" w:hAnsiTheme="minorEastAsia" w:cs="굴림" w:hint="eastAsia"/>
@@ -3455,6 +3759,7 @@
               </w:rPr>
               <w:t>만원</w:t>
             </w:r>
+            <w:proofErr w:type="spellEnd"/>
             <w:r>
               <w:rPr>
                 <w:rFonts w:asciiTheme="minorEastAsia" w:eastAsiaTheme="minorEastAsia" w:hAnsiTheme="minorEastAsia" w:cs="굴림" w:hint="eastAsia"/>
@@ -3521,6 +3826,7 @@
         </w:rPr>
         <w:t>*”</w:t>
       </w:r>
+      <w:proofErr w:type="spellStart"/>
       <w:r>
         <w:rPr>
           <w:rFonts w:asciiTheme="minorEastAsia" w:eastAsiaTheme="minorEastAsia" w:hAnsiTheme="minorEastAsia" w:cs="굴림" w:hint="eastAsia"/>
@@ -3533,6 +3839,7 @@
         </w:rPr>
         <w:t>미디어렙</w:t>
       </w:r>
+      <w:proofErr w:type="spellEnd"/>
       <w:r>
         <w:rPr>
           <w:rFonts w:asciiTheme="minorEastAsia" w:eastAsiaTheme="minorEastAsia" w:hAnsiTheme="minorEastAsia" w:cs="굴림"/>
@@ -4091,6 +4398,7 @@
           <w:szCs w:val="22"/>
         </w:rPr>
       </w:pPr>
+      <w:proofErr w:type="gramStart"/>
       <w:r>
         <w:rPr>
           <w:rFonts w:asciiTheme="minorEastAsia" w:eastAsiaTheme="minorEastAsia" w:hAnsiTheme="minorEastAsia" w:cs="굴림" w:hint="eastAsia"/>
@@ -4109,7 +4417,18 @@
           <w:sz w:val="22"/>
           <w:szCs w:val="22"/>
         </w:rPr>
-        <w:t xml:space="preserve">6 </w:t>
+        <w:t>6</w:t>
+      </w:r>
+      <w:proofErr w:type="gramEnd"/>
+      <w:r>
+        <w:rPr>
+          <w:rFonts w:asciiTheme="minorEastAsia" w:eastAsiaTheme="minorEastAsia" w:hAnsiTheme="minorEastAsia" w:cs="굴림"/>
+          <w:b/>
+          <w:color w:val="auto"/>
+          <w:sz w:val="22"/>
+          <w:szCs w:val="22"/>
+        </w:rPr>
+        <w:t xml:space="preserve"> </w:t>
       </w:r>
       <w:r>
         <w:rPr>
@@ -4131,6 +4450,7 @@
         </w:rPr>
         <w:t>“</w:t>
       </w:r>
+      <w:proofErr w:type="spellStart"/>
       <w:r>
         <w:rPr>
           <w:rFonts w:asciiTheme="minorEastAsia" w:eastAsiaTheme="minorEastAsia" w:hAnsiTheme="minorEastAsia" w:cs="굴림" w:hint="eastAsia"/>
@@ -4141,6 +4461,7 @@
         </w:rPr>
         <w:t>미디어렙</w:t>
       </w:r>
+      <w:proofErr w:type="spellEnd"/>
       <w:r>
         <w:rPr>
           <w:rFonts w:asciiTheme="minorEastAsia" w:eastAsiaTheme="minorEastAsia" w:hAnsiTheme="minorEastAsia" w:cs="굴림"/>
@@ -4187,6 +4508,7 @@
         </w:rPr>
         <w:t>“</w:t>
       </w:r>
+      <w:proofErr w:type="spellStart"/>
       <w:r>
         <w:rPr>
           <w:rFonts w:asciiTheme="minorEastAsia" w:eastAsiaTheme="minorEastAsia" w:hAnsiTheme="minorEastAsia" w:cs="굴림" w:hint="eastAsia"/>
@@ -4196,6 +4518,7 @@
         </w:rPr>
         <w:t>미디어렙</w:t>
       </w:r>
+      <w:proofErr w:type="spellEnd"/>
       <w:r>
         <w:rPr>
           <w:rFonts w:asciiTheme="minorEastAsia" w:eastAsiaTheme="minorEastAsia" w:hAnsiTheme="minorEastAsia" w:cs="굴림"/>
@@ -4376,6 +4699,7 @@
         </w:rPr>
         <w:t>조 (</w:t>
       </w:r>
+      <w:proofErr w:type="spellStart"/>
       <w:r>
         <w:rPr>
           <w:rFonts w:asciiTheme="minorEastAsia" w:eastAsiaTheme="minorEastAsia" w:hAnsiTheme="minorEastAsia" w:cs="굴림" w:hint="eastAsia"/>
@@ -4385,6 +4709,7 @@
         </w:rPr>
         <w:t>집행금</w:t>
       </w:r>
+      <w:proofErr w:type="spellEnd"/>
       <w:r>
         <w:rPr>
           <w:rFonts w:asciiTheme="minorEastAsia" w:eastAsiaTheme="minorEastAsia" w:hAnsiTheme="minorEastAsia" w:cs="굴림"/>
@@ -4455,6 +4780,7 @@
         </w:rPr>
         <w:t>“</w:t>
       </w:r>
+      <w:proofErr w:type="spellStart"/>
       <w:r>
         <w:rPr>
           <w:rFonts w:asciiTheme="minorEastAsia" w:eastAsiaTheme="minorEastAsia" w:hAnsiTheme="minorEastAsia" w:cs="굴림" w:hint="eastAsia"/>
@@ -4464,6 +4790,7 @@
         </w:rPr>
         <w:t>미디어렙</w:t>
       </w:r>
+      <w:proofErr w:type="spellEnd"/>
       <w:r>
         <w:rPr>
           <w:rFonts w:asciiTheme="minorEastAsia" w:eastAsiaTheme="minorEastAsia" w:hAnsiTheme="minorEastAsia" w:cs="굴림"/>
@@ -4678,6 +5005,7 @@
         </w:rPr>
         <w:t>“</w:t>
       </w:r>
+      <w:proofErr w:type="spellStart"/>
       <w:r>
         <w:rPr>
           <w:rFonts w:asciiTheme="minorEastAsia" w:eastAsiaTheme="minorEastAsia" w:hAnsiTheme="minorEastAsia" w:cs="굴림" w:hint="eastAsia"/>
@@ -4687,6 +5015,7 @@
         </w:rPr>
         <w:t>미디어렙</w:t>
       </w:r>
+      <w:proofErr w:type="spellEnd"/>
       <w:r>
         <w:rPr>
           <w:rFonts w:asciiTheme="minorEastAsia" w:eastAsiaTheme="minorEastAsia" w:hAnsiTheme="minorEastAsia" w:cs="굴림"/>
@@ -4748,7 +5077,27 @@
           <w:sz w:val="22"/>
           <w:szCs w:val="22"/>
         </w:rPr>
-        <w:t xml:space="preserve">가 라이선스를 사용해서 만든 결과물(홍보문 시안 등)을 사용하기 전 </w:t>
+        <w:t>가 라이선스를 사용해서 만든 결과물(</w:t>
+      </w:r>
+      <w:proofErr w:type="spellStart"/>
+      <w:r>
+        <w:rPr>
+          <w:rFonts w:asciiTheme="minorEastAsia" w:eastAsiaTheme="minorEastAsia" w:hAnsiTheme="minorEastAsia" w:cs="굴림" w:hint="eastAsia"/>
+          <w:color w:val="auto"/>
+          <w:sz w:val="22"/>
+          <w:szCs w:val="22"/>
+        </w:rPr>
+        <w:t>홍보문</w:t>
+      </w:r>
+      <w:proofErr w:type="spellEnd"/>
+      <w:r>
+        <w:rPr>
+          <w:rFonts w:asciiTheme="minorEastAsia" w:eastAsiaTheme="minorEastAsia" w:hAnsiTheme="minorEastAsia" w:cs="굴림" w:hint="eastAsia"/>
+          <w:color w:val="auto"/>
+          <w:sz w:val="22"/>
+          <w:szCs w:val="22"/>
+        </w:rPr>
+        <w:t xml:space="preserve"> 시안 등)을 사용하기 전 </w:t>
       </w:r>
       <w:r>
         <w:rPr>
@@ -4866,6 +5215,7 @@
           <w:szCs w:val="22"/>
         </w:rPr>
       </w:pPr>
+      <w:proofErr w:type="gramStart"/>
       <w:r>
         <w:rPr>
           <w:rFonts w:asciiTheme="minorEastAsia" w:eastAsiaTheme="minorEastAsia" w:hAnsiTheme="minorEastAsia" w:cs="굴림" w:hint="eastAsia"/>
@@ -4886,6 +5236,7 @@
         </w:rPr>
         <w:t>7</w:t>
       </w:r>
+      <w:proofErr w:type="gramEnd"/>
       <w:r>
         <w:rPr>
           <w:rFonts w:asciiTheme="minorEastAsia" w:eastAsiaTheme="minorEastAsia" w:hAnsiTheme="minorEastAsia" w:cs="굴림" w:hint="eastAsia"/>
@@ -5283,6 +5634,7 @@
           <w:szCs w:val="22"/>
         </w:rPr>
       </w:pPr>
+      <w:proofErr w:type="gramStart"/>
       <w:r>
         <w:rPr>
           <w:rFonts w:asciiTheme="minorEastAsia" w:eastAsiaTheme="minorEastAsia" w:hAnsiTheme="minorEastAsia" w:cs="굴림" w:hint="eastAsia"/>
@@ -5305,6 +5657,7 @@
         </w:rPr>
         <w:t>8</w:t>
       </w:r>
+      <w:proofErr w:type="gramEnd"/>
       <w:r>
         <w:rPr>
           <w:rFonts w:asciiTheme="minorEastAsia" w:eastAsiaTheme="minorEastAsia" w:hAnsiTheme="minorEastAsia" w:cs="굴림"/>
@@ -5338,6 +5691,7 @@
         </w:rPr>
         <w:t>(</w:t>
       </w:r>
+      <w:proofErr w:type="spellStart"/>
       <w:r>
         <w:rPr>
           <w:rFonts w:asciiTheme="minorEastAsia" w:eastAsiaTheme="minorEastAsia" w:hAnsiTheme="minorEastAsia" w:cs="굴림" w:hint="eastAsia"/>
@@ -5349,6 +5703,7 @@
         </w:rPr>
         <w:t>집행금</w:t>
       </w:r>
+      <w:proofErr w:type="spellEnd"/>
       <w:r>
         <w:rPr>
           <w:rFonts w:asciiTheme="minorEastAsia" w:eastAsiaTheme="minorEastAsia" w:hAnsiTheme="minorEastAsia" w:cs="굴림" w:hint="eastAsia"/>
@@ -5396,6 +5751,7 @@
         </w:rPr>
         <w:t>“</w:t>
       </w:r>
+      <w:proofErr w:type="spellStart"/>
       <w:r>
         <w:rPr>
           <w:rFonts w:asciiTheme="majorHAnsi" w:eastAsiaTheme="majorHAnsi" w:hAnsiTheme="majorHAnsi" w:cs="굴림" w:hint="eastAsia"/>
@@ -5405,6 +5761,7 @@
         </w:rPr>
         <w:t>미디어렙</w:t>
       </w:r>
+      <w:proofErr w:type="spellEnd"/>
       <w:r>
         <w:rPr>
           <w:rFonts w:asciiTheme="majorHAnsi" w:eastAsiaTheme="majorHAnsi" w:hAnsiTheme="majorHAnsi" w:cs="굴림"/>
@@ -5540,6 +5897,7 @@
                 <w:highlight w:val="yellow"/>
               </w:rPr>
             </w:pPr>
+            <w:proofErr w:type="spellStart"/>
             <w:r>
               <w:rPr>
                 <w:rFonts w:asciiTheme="minorEastAsia" w:eastAsiaTheme="minorEastAsia" w:hAnsiTheme="minorEastAsia" w:cs="굴림" w:hint="eastAsia"/>
@@ -5547,8 +5905,10 @@
                 <w:bCs/>
                 <w:highlight w:val="yellow"/>
               </w:rPr>
+              <w:lastRenderedPageBreak/>
               <w:t>청구월</w:t>
             </w:r>
+            <w:proofErr w:type="spellEnd"/>
           </w:p>
         </w:tc>
         <w:tc>
@@ -5705,15 +6065,16 @@
                 <w:highlight w:val="yellow"/>
               </w:rPr>
             </w:pPr>
+            <w:proofErr w:type="spellStart"/>
             <w:r>
               <w:rPr>
                 <w:rFonts w:asciiTheme="minorEastAsia" w:eastAsiaTheme="minorEastAsia" w:hAnsiTheme="minorEastAsia" w:cs="굴림" w:hint="eastAsia"/>
                 <w:color w:val="auto"/>
                 <w:highlight w:val="yellow"/>
               </w:rPr>
-              <w:lastRenderedPageBreak/>
               <w:t>방송월</w:t>
             </w:r>
+            <w:proofErr w:type="spellEnd"/>
           </w:p>
         </w:tc>
         <w:tc>
@@ -5865,6 +6226,7 @@
               </w:rPr>
               <w:t xml:space="preserve">세금계산서 </w:t>
             </w:r>
+            <w:proofErr w:type="spellStart"/>
             <w:r>
               <w:rPr>
                 <w:rFonts w:asciiTheme="minorEastAsia" w:eastAsiaTheme="minorEastAsia" w:hAnsiTheme="minorEastAsia" w:cs="굴림" w:hint="eastAsia"/>
@@ -5877,7 +6239,15 @@
                 <w:rFonts w:asciiTheme="minorEastAsia" w:eastAsiaTheme="minorEastAsia" w:hAnsiTheme="minorEastAsia" w:cs="굴림" w:hint="eastAsia"/>
                 <w:highlight w:val="yellow"/>
               </w:rPr>
-              <w:t>월 발행</w:t>
+              <w:t>월</w:t>
+            </w:r>
+            <w:proofErr w:type="spellEnd"/>
+            <w:r>
+              <w:rPr>
+                <w:rFonts w:asciiTheme="minorEastAsia" w:eastAsiaTheme="minorEastAsia" w:hAnsiTheme="minorEastAsia" w:cs="굴림" w:hint="eastAsia"/>
+                <w:highlight w:val="yellow"/>
+              </w:rPr>
+              <w:t xml:space="preserve"> 발행</w:t>
             </w:r>
           </w:p>
           <w:p>
@@ -5897,6 +6267,7 @@
               </w:rPr>
               <w:t xml:space="preserve">SBS -&gt; </w:t>
             </w:r>
+            <w:proofErr w:type="spellStart"/>
             <w:r>
               <w:rPr>
                 <w:rFonts w:asciiTheme="minorEastAsia" w:eastAsiaTheme="minorEastAsia" w:hAnsiTheme="minorEastAsia" w:cs="굴림" w:hint="eastAsia"/>
@@ -5904,6 +6275,7 @@
               </w:rPr>
               <w:t>미디어렙</w:t>
             </w:r>
+            <w:proofErr w:type="spellEnd"/>
           </w:p>
         </w:tc>
         <w:tc>
@@ -6038,6 +6410,7 @@
               </w:rPr>
               <w:t xml:space="preserve">세금계산서 </w:t>
             </w:r>
+            <w:proofErr w:type="spellStart"/>
             <w:r>
               <w:rPr>
                 <w:rFonts w:asciiTheme="minorEastAsia" w:eastAsiaTheme="minorEastAsia" w:hAnsiTheme="minorEastAsia" w:cs="굴림" w:hint="eastAsia"/>
@@ -6050,7 +6423,15 @@
                 <w:rFonts w:asciiTheme="minorEastAsia" w:eastAsiaTheme="minorEastAsia" w:hAnsiTheme="minorEastAsia" w:cs="굴림" w:hint="eastAsia"/>
                 <w:highlight w:val="yellow"/>
               </w:rPr>
-              <w:t>월 발행</w:t>
+              <w:t>월</w:t>
+            </w:r>
+            <w:proofErr w:type="spellEnd"/>
+            <w:r>
+              <w:rPr>
+                <w:rFonts w:asciiTheme="minorEastAsia" w:eastAsiaTheme="minorEastAsia" w:hAnsiTheme="minorEastAsia" w:cs="굴림" w:hint="eastAsia"/>
+                <w:highlight w:val="yellow"/>
+              </w:rPr>
+              <w:t xml:space="preserve"> 발행</w:t>
             </w:r>
           </w:p>
           <w:p>
@@ -6063,6 +6444,7 @@
                 <w:highlight w:val="yellow"/>
               </w:rPr>
             </w:pPr>
+            <w:proofErr w:type="spellStart"/>
             <w:r>
               <w:rPr>
                 <w:rFonts w:asciiTheme="minorEastAsia" w:eastAsiaTheme="minorEastAsia" w:hAnsiTheme="minorEastAsia" w:cs="굴림" w:hint="eastAsia"/>
@@ -6070,6 +6452,7 @@
               </w:rPr>
               <w:t>미디어렙</w:t>
             </w:r>
+            <w:proofErr w:type="spellEnd"/>
             <w:r>
               <w:rPr>
                 <w:rFonts w:asciiTheme="minorEastAsia" w:eastAsiaTheme="minorEastAsia" w:hAnsiTheme="minorEastAsia" w:cs="굴림"/>
@@ -6130,6 +6513,7 @@
         </w:rPr>
         <w:t xml:space="preserve"> “</w:t>
       </w:r>
+      <w:proofErr w:type="spellStart"/>
       <w:r>
         <w:rPr>
           <w:rFonts w:asciiTheme="majorHAnsi" w:eastAsiaTheme="majorHAnsi" w:hAnsiTheme="majorHAnsi" w:cs="굴림" w:hint="eastAsia"/>
@@ -6139,6 +6523,7 @@
         </w:rPr>
         <w:t>미디어렙</w:t>
       </w:r>
+      <w:proofErr w:type="spellEnd"/>
       <w:r>
         <w:rPr>
           <w:rFonts w:asciiTheme="majorHAnsi" w:eastAsiaTheme="majorHAnsi" w:hAnsiTheme="majorHAnsi" w:cs="굴림"/>
@@ -6390,6 +6775,7 @@
           <w:szCs w:val="22"/>
         </w:rPr>
       </w:pPr>
+      <w:proofErr w:type="gramStart"/>
       <w:r>
         <w:rPr>
           <w:rFonts w:asciiTheme="minorEastAsia" w:eastAsiaTheme="minorEastAsia" w:hAnsiTheme="minorEastAsia" w:cs="굴림" w:hint="eastAsia"/>
@@ -6412,6 +6798,7 @@
         </w:rPr>
         <w:t>9</w:t>
       </w:r>
+      <w:proofErr w:type="gramEnd"/>
       <w:r>
         <w:rPr>
           <w:rFonts w:asciiTheme="minorEastAsia" w:eastAsiaTheme="minorEastAsia" w:hAnsiTheme="minorEastAsia" w:cs="굴림" w:hint="eastAsia"/>
@@ -6446,7 +6833,87 @@
           <w:sz w:val="22"/>
           <w:szCs w:val="22"/>
         </w:rPr>
-        <w:t>프로그램(촬영 원본 소재 자료 포함)에 대한 국내외의 방송권, 복제권, 배포권, 전송권, 공연권, 전시권, 2차적 저작물작성권, 편집저작물작성권 등 일체의 저작권 및 지식재산권은 "SBS"에게 있다. 단, 초상권 또는 퍼블리시티권과 음악저작권 등 "SBS"가 보유하지 않은 권리는 제외한다.</w:t>
+        <w:t xml:space="preserve">프로그램(촬영 원본 소재 자료 포함)에 대한 국내외의 방송권, 복제권, </w:t>
+      </w:r>
+      <w:proofErr w:type="spellStart"/>
+      <w:r>
+        <w:rPr>
+          <w:rFonts w:asciiTheme="minorEastAsia" w:eastAsiaTheme="minorEastAsia" w:hAnsiTheme="minorEastAsia" w:cs="굴림" w:hint="eastAsia"/>
+          <w:color w:val="auto"/>
+          <w:sz w:val="22"/>
+          <w:szCs w:val="22"/>
+        </w:rPr>
+        <w:t>배포권</w:t>
+      </w:r>
+      <w:proofErr w:type="spellEnd"/>
+      <w:r>
+        <w:rPr>
+          <w:rFonts w:asciiTheme="minorEastAsia" w:eastAsiaTheme="minorEastAsia" w:hAnsiTheme="minorEastAsia" w:cs="굴림" w:hint="eastAsia"/>
+          <w:color w:val="auto"/>
+          <w:sz w:val="22"/>
+          <w:szCs w:val="22"/>
+        </w:rPr>
+        <w:t xml:space="preserve">, </w:t>
+      </w:r>
+      <w:proofErr w:type="spellStart"/>
+      <w:r>
+        <w:rPr>
+          <w:rFonts w:asciiTheme="minorEastAsia" w:eastAsiaTheme="minorEastAsia" w:hAnsiTheme="minorEastAsia" w:cs="굴림" w:hint="eastAsia"/>
+          <w:color w:val="auto"/>
+          <w:sz w:val="22"/>
+          <w:szCs w:val="22"/>
+        </w:rPr>
+        <w:t>전송권</w:t>
+      </w:r>
+      <w:proofErr w:type="spellEnd"/>
+      <w:r>
+        <w:rPr>
+          <w:rFonts w:asciiTheme="minorEastAsia" w:eastAsiaTheme="minorEastAsia" w:hAnsiTheme="minorEastAsia" w:cs="굴림" w:hint="eastAsia"/>
+          <w:color w:val="auto"/>
+          <w:sz w:val="22"/>
+          <w:szCs w:val="22"/>
+        </w:rPr>
+        <w:t xml:space="preserve">, 공연권, </w:t>
+      </w:r>
+      <w:proofErr w:type="spellStart"/>
+      <w:r>
+        <w:rPr>
+          <w:rFonts w:asciiTheme="minorEastAsia" w:eastAsiaTheme="minorEastAsia" w:hAnsiTheme="minorEastAsia" w:cs="굴림" w:hint="eastAsia"/>
+          <w:color w:val="auto"/>
+          <w:sz w:val="22"/>
+          <w:szCs w:val="22"/>
+        </w:rPr>
+        <w:t>전시권</w:t>
+      </w:r>
+      <w:proofErr w:type="spellEnd"/>
+      <w:r>
+        <w:rPr>
+          <w:rFonts w:asciiTheme="minorEastAsia" w:eastAsiaTheme="minorEastAsia" w:hAnsiTheme="minorEastAsia" w:cs="굴림" w:hint="eastAsia"/>
+          <w:color w:val="auto"/>
+          <w:sz w:val="22"/>
+          <w:szCs w:val="22"/>
+        </w:rPr>
+        <w:t xml:space="preserve">, 2차적 저작물작성권, 편집저작물작성권 등 일체의 저작권 및 지식재산권은 "SBS"에게 있다. 단, 초상권 또는 </w:t>
+      </w:r>
+      <w:proofErr w:type="spellStart"/>
+      <w:r>
+        <w:rPr>
+          <w:rFonts w:asciiTheme="minorEastAsia" w:eastAsiaTheme="minorEastAsia" w:hAnsiTheme="minorEastAsia" w:cs="굴림" w:hint="eastAsia"/>
+          <w:color w:val="auto"/>
+          <w:sz w:val="22"/>
+          <w:szCs w:val="22"/>
+        </w:rPr>
+        <w:t>퍼블리시티권과</w:t>
+      </w:r>
+      <w:proofErr w:type="spellEnd"/>
+      <w:r>
+        <w:rPr>
+          <w:rFonts w:asciiTheme="minorEastAsia" w:eastAsiaTheme="minorEastAsia" w:hAnsiTheme="minorEastAsia" w:cs="굴림" w:hint="eastAsia"/>
+          <w:color w:val="auto"/>
+          <w:sz w:val="22"/>
+          <w:szCs w:val="22"/>
+        </w:rPr>
+        <w:t xml:space="preserve"> 음악저작권 등 "SBS"가 보유하지 않은 권리는 제외한다.</w:t>
       </w:r>
     </w:p>
     <w:p>
@@ -6473,6 +6940,7 @@
         </w:rPr>
         <w:t>“</w:t>
       </w:r>
+      <w:proofErr w:type="spellStart"/>
       <w:r>
         <w:rPr>
           <w:rFonts w:asciiTheme="minorEastAsia" w:eastAsiaTheme="minorEastAsia" w:hAnsiTheme="minorEastAsia" w:cs="굴림" w:hint="eastAsia"/>
@@ -6482,6 +6950,7 @@
         </w:rPr>
         <w:t>미디어렙</w:t>
       </w:r>
+      <w:proofErr w:type="spellEnd"/>
       <w:r>
         <w:rPr>
           <w:rFonts w:asciiTheme="minorEastAsia" w:eastAsiaTheme="minorEastAsia" w:hAnsiTheme="minorEastAsia" w:cs="굴림"/>
@@ -6662,6 +7131,7 @@
         </w:rPr>
         <w:t>“</w:t>
       </w:r>
+      <w:proofErr w:type="spellStart"/>
       <w:r>
         <w:rPr>
           <w:rFonts w:asciiTheme="minorEastAsia" w:eastAsiaTheme="minorEastAsia" w:hAnsiTheme="minorEastAsia" w:cs="굴림" w:hint="eastAsia"/>
@@ -6671,6 +7141,7 @@
         </w:rPr>
         <w:t>미디어렙</w:t>
       </w:r>
+      <w:proofErr w:type="spellEnd"/>
       <w:r>
         <w:rPr>
           <w:rFonts w:asciiTheme="minorEastAsia" w:eastAsiaTheme="minorEastAsia" w:hAnsiTheme="minorEastAsia" w:cs="굴림"/>
@@ -6734,6 +7205,7 @@
         </w:rPr>
         <w:t>“</w:t>
       </w:r>
+      <w:proofErr w:type="spellStart"/>
       <w:r>
         <w:rPr>
           <w:rFonts w:asciiTheme="minorEastAsia" w:eastAsiaTheme="minorEastAsia" w:hAnsiTheme="minorEastAsia" w:cs="굴림" w:hint="eastAsia"/>
@@ -6743,6 +7215,7 @@
         </w:rPr>
         <w:t>미디어렙</w:t>
       </w:r>
+      <w:proofErr w:type="spellEnd"/>
       <w:r>
         <w:rPr>
           <w:rFonts w:asciiTheme="minorEastAsia" w:eastAsiaTheme="minorEastAsia" w:hAnsiTheme="minorEastAsia" w:cs="굴림"/>
@@ -6824,6 +7297,7 @@
           <w:szCs w:val="22"/>
         </w:rPr>
       </w:pPr>
+      <w:proofErr w:type="gramStart"/>
       <w:r>
         <w:rPr>
           <w:rFonts w:asciiTheme="minorEastAsia" w:eastAsiaTheme="minorEastAsia" w:hAnsiTheme="minorEastAsia" w:cs="굴림" w:hint="eastAsia"/>
@@ -6868,6 +7342,7 @@
         </w:rPr>
         <w:t>0</w:t>
       </w:r>
+      <w:proofErr w:type="gramEnd"/>
       <w:r>
         <w:rPr>
           <w:rFonts w:asciiTheme="minorEastAsia" w:eastAsiaTheme="minorEastAsia" w:hAnsiTheme="minorEastAsia" w:cs="굴림" w:hint="eastAsia"/>
@@ -6997,6 +7472,7 @@
           <w:szCs w:val="22"/>
         </w:rPr>
       </w:pPr>
+      <w:proofErr w:type="gramStart"/>
       <w:r>
         <w:rPr>
           <w:rFonts w:asciiTheme="minorEastAsia" w:eastAsiaTheme="minorEastAsia" w:hAnsiTheme="minorEastAsia" w:cs="굴림" w:hint="eastAsia"/>
@@ -7019,6 +7495,7 @@
         </w:rPr>
         <w:t>11</w:t>
       </w:r>
+      <w:proofErr w:type="gramEnd"/>
       <w:r>
         <w:rPr>
           <w:rFonts w:asciiTheme="minorEastAsia" w:eastAsiaTheme="minorEastAsia" w:hAnsiTheme="minorEastAsia" w:cs="굴림" w:hint="eastAsia"/>
@@ -7105,7 +7582,27 @@
           <w:sz w:val="22"/>
           <w:szCs w:val="22"/>
         </w:rPr>
-        <w:t>“미디어렙”은 "본</w:t>
+        <w:t>“</w:t>
+      </w:r>
+      <w:proofErr w:type="spellStart"/>
+      <w:r>
+        <w:rPr>
+          <w:rFonts w:asciiTheme="minorEastAsia" w:eastAsiaTheme="minorEastAsia" w:hAnsiTheme="minorEastAsia" w:cs="굴림" w:hint="eastAsia"/>
+          <w:color w:val="auto"/>
+          <w:sz w:val="22"/>
+          <w:szCs w:val="22"/>
+        </w:rPr>
+        <w:t>미디어렙”은</w:t>
+      </w:r>
+      <w:proofErr w:type="spellEnd"/>
+      <w:r>
+        <w:rPr>
+          <w:rFonts w:asciiTheme="minorEastAsia" w:eastAsiaTheme="minorEastAsia" w:hAnsiTheme="minorEastAsia" w:cs="굴림" w:hint="eastAsia"/>
+          <w:color w:val="auto"/>
+          <w:sz w:val="22"/>
+          <w:szCs w:val="22"/>
+        </w:rPr>
+        <w:t xml:space="preserve"> "본</w:t>
       </w:r>
       <w:r>
         <w:rPr>
@@ -7364,6 +7861,7 @@
           <w:sz w:val="22"/>
           <w:szCs w:val="22"/>
         </w:rPr>
+        <w:lastRenderedPageBreak/>
         <w:t>손해배상은 당사자의 귀책부분으로 인한 부담분에 한정되며 다른 당사자의 귀책부분으로 인한 부담분에 대하여 연대 배상할 의무는 없다.</w:t>
       </w:r>
     </w:p>
@@ -7393,16 +7891,16 @@
           <w:szCs w:val="22"/>
         </w:rPr>
       </w:pPr>
-      <w:r>
-        <w:rPr>
-          <w:rFonts w:asciiTheme="minorEastAsia" w:eastAsiaTheme="minorEastAsia" w:hAnsiTheme="minorEastAsia" w:cs="굴림" w:hint="eastAsia"/>
-          <w:b/>
-          <w:bCs/>
-          <w:color w:val="auto"/>
-          <w:sz w:val="22"/>
-          <w:szCs w:val="22"/>
-        </w:rPr>
-        <w:lastRenderedPageBreak/>
+      <w:proofErr w:type="gramStart"/>
+      <w:r>
+        <w:rPr>
+          <w:rFonts w:asciiTheme="minorEastAsia" w:eastAsiaTheme="minorEastAsia" w:hAnsiTheme="minorEastAsia" w:cs="굴림" w:hint="eastAsia"/>
+          <w:b/>
+          <w:bCs/>
+          <w:color w:val="auto"/>
+          <w:sz w:val="22"/>
+          <w:szCs w:val="22"/>
+        </w:rPr>
         <w:t xml:space="preserve">제 </w:t>
       </w:r>
       <w:r>
@@ -7427,6 +7925,7 @@
         </w:rPr>
         <w:t>3</w:t>
       </w:r>
+      <w:proofErr w:type="gramEnd"/>
       <w:r>
         <w:rPr>
           <w:rFonts w:asciiTheme="minorEastAsia" w:eastAsiaTheme="minorEastAsia" w:hAnsiTheme="minorEastAsia" w:cs="굴림" w:hint="eastAsia"/>
@@ -7513,6 +8012,7 @@
           <w:szCs w:val="22"/>
         </w:rPr>
       </w:pPr>
+      <w:proofErr w:type="gramStart"/>
       <w:r>
         <w:rPr>
           <w:rFonts w:asciiTheme="minorEastAsia" w:eastAsiaTheme="minorEastAsia" w:hAnsiTheme="minorEastAsia" w:cs="굴림" w:hint="eastAsia"/>
@@ -7543,6 +8043,7 @@
         </w:rPr>
         <w:t>4</w:t>
       </w:r>
+      <w:proofErr w:type="gramEnd"/>
       <w:r>
         <w:rPr>
           <w:rFonts w:asciiTheme="minorEastAsia" w:eastAsiaTheme="minorEastAsia" w:hAnsiTheme="minorEastAsia" w:cs="굴림" w:hint="eastAsia"/>
@@ -7613,7 +8114,29 @@
           <w:sz w:val="22"/>
           <w:szCs w:val="22"/>
         </w:rPr>
-        <w:t xml:space="preserve"> “미디어렙”은 "본 계약"의 체결, 이행과정, 계약 종료 후에도 "본 계약"과</w:t>
+        <w:t xml:space="preserve"> “</w:t>
+      </w:r>
+      <w:proofErr w:type="spellStart"/>
+      <w:r>
+        <w:rPr>
+          <w:rFonts w:asciiTheme="minorEastAsia" w:eastAsiaTheme="minorEastAsia" w:hAnsiTheme="minorEastAsia" w:cs="굴림" w:hint="eastAsia"/>
+          <w:color w:val="auto"/>
+          <w:spacing w:val="-4"/>
+          <w:sz w:val="22"/>
+          <w:szCs w:val="22"/>
+        </w:rPr>
+        <w:t>미디어렙”은</w:t>
+      </w:r>
+      <w:proofErr w:type="spellEnd"/>
+      <w:r>
+        <w:rPr>
+          <w:rFonts w:asciiTheme="minorEastAsia" w:eastAsiaTheme="minorEastAsia" w:hAnsiTheme="minorEastAsia" w:cs="굴림" w:hint="eastAsia"/>
+          <w:color w:val="auto"/>
+          <w:spacing w:val="-4"/>
+          <w:sz w:val="22"/>
+          <w:szCs w:val="22"/>
+        </w:rPr>
+        <w:t xml:space="preserve"> "본 계약"의 체결, 이행과정, 계약 종료 후에도 "본 계약"과</w:t>
       </w:r>
       <w:r>
         <w:rPr>
@@ -7647,6 +8170,7 @@
           <w:szCs w:val="22"/>
         </w:rPr>
       </w:pPr>
+      <w:proofErr w:type="gramStart"/>
       <w:r>
         <w:rPr>
           <w:rFonts w:asciiTheme="minorEastAsia" w:eastAsiaTheme="minorEastAsia" w:hAnsiTheme="minorEastAsia" w:cs="굴림" w:hint="eastAsia"/>
@@ -7669,6 +8193,7 @@
         </w:rPr>
         <w:t>5</w:t>
       </w:r>
+      <w:proofErr w:type="gramEnd"/>
       <w:r>
         <w:rPr>
           <w:rFonts w:asciiTheme="minorEastAsia" w:eastAsiaTheme="minorEastAsia" w:hAnsiTheme="minorEastAsia" w:cs="굴림" w:hint="eastAsia"/>
@@ -7712,6 +8237,7 @@
         </w:rPr>
         <w:t>“</w:t>
       </w:r>
+      <w:proofErr w:type="spellStart"/>
       <w:r>
         <w:rPr>
           <w:rFonts w:asciiTheme="minorEastAsia" w:eastAsiaTheme="minorEastAsia" w:hAnsiTheme="minorEastAsia" w:cs="굴림" w:hint="eastAsia"/>
@@ -7721,6 +8247,7 @@
         </w:rPr>
         <w:t>미디어렙</w:t>
       </w:r>
+      <w:proofErr w:type="spellEnd"/>
       <w:r>
         <w:rPr>
           <w:rFonts w:asciiTheme="minorEastAsia" w:eastAsiaTheme="minorEastAsia" w:hAnsiTheme="minorEastAsia" w:cs="굴림"/>
@@ -7858,6 +8385,7 @@
           <w:szCs w:val="22"/>
         </w:rPr>
       </w:pPr>
+      <w:proofErr w:type="gramStart"/>
       <w:r>
         <w:rPr>
           <w:rFonts w:asciiTheme="minorEastAsia" w:eastAsiaTheme="minorEastAsia" w:hAnsiTheme="minorEastAsia" w:cs="굴림" w:hint="eastAsia"/>
@@ -7891,6 +8419,7 @@
         </w:rPr>
         <w:t>6</w:t>
       </w:r>
+      <w:proofErr w:type="gramEnd"/>
       <w:r>
         <w:rPr>
           <w:rFonts w:asciiTheme="minorEastAsia" w:eastAsiaTheme="minorEastAsia" w:hAnsiTheme="minorEastAsia" w:cs="굴림" w:hint="eastAsia"/>
@@ -8125,6 +8654,7 @@
         </w:rPr>
         <w:t>1</w:t>
       </w:r>
+      <w:proofErr w:type="gramStart"/>
       <w:r>
         <w:rPr>
           <w:rFonts w:asciiTheme="minorEastAsia" w:eastAsiaTheme="minorEastAsia" w:hAnsiTheme="minorEastAsia" w:cs="굴림" w:hint="eastAsia"/>
@@ -8145,6 +8675,7 @@
         </w:rPr>
         <w:t>04</w:t>
       </w:r>
+      <w:proofErr w:type="gramEnd"/>
       <w:r>
         <w:rPr>
           <w:rFonts w:asciiTheme="minorEastAsia" w:eastAsiaTheme="minorEastAsia" w:hAnsiTheme="minorEastAsia" w:cs="굴림" w:hint="eastAsia"/>
@@ -8238,6 +8769,7 @@
         </w:rPr>
         <w:t xml:space="preserve">주식회사 </w:t>
       </w:r>
+      <w:proofErr w:type="spellStart"/>
       <w:r>
         <w:rPr>
           <w:rFonts w:asciiTheme="minorEastAsia" w:eastAsiaTheme="minorEastAsia" w:hAnsiTheme="minorEastAsia" w:cs="굴림" w:hint="eastAsia"/>
@@ -8247,6 +8779,7 @@
         </w:rPr>
         <w:t>에스비에스</w:t>
       </w:r>
+      <w:proofErr w:type="spellEnd"/>
     </w:p>
     <w:p>
       <w:pPr>
@@ -8290,6 +8823,7 @@
         </w:rPr>
         <w:t>[</w:t>
       </w:r>
+      <w:proofErr w:type="gramStart"/>
       <w:r>
         <w:rPr>
           <w:rFonts w:asciiTheme="minorEastAsia" w:eastAsiaTheme="minorEastAsia" w:hAnsiTheme="minorEastAsia" w:cs="굴림" w:hint="eastAsia"/>
@@ -8320,6 +8854,7 @@
         </w:rPr>
         <w:t>방</w:t>
       </w:r>
+      <w:proofErr w:type="gramEnd"/>
       <w:r>
         <w:rPr>
           <w:rFonts w:asciiTheme="minorEastAsia" w:eastAsiaTheme="minorEastAsia" w:hAnsiTheme="minorEastAsia" w:cs="굴림" w:hint="eastAsia"/>
@@ -8424,7 +8959,31 @@
           <w:sz w:val="22"/>
           <w:szCs w:val="22"/>
         </w:rPr>
-        <w:t>“미디어렙”</w:t>
+        <w:t>“</w:t>
+      </w:r>
+      <w:proofErr w:type="spellStart"/>
+      <w:r>
+        <w:rPr>
+          <w:rFonts w:asciiTheme="minorEastAsia" w:eastAsiaTheme="minorEastAsia" w:hAnsiTheme="minorEastAsia" w:cs="굴림" w:hint="eastAsia"/>
+          <w:b/>
+          <w:bCs/>
+          <w:color w:val="auto"/>
+          <w:sz w:val="22"/>
+          <w:szCs w:val="22"/>
+        </w:rPr>
+        <w:t>미디어렙</w:t>
+      </w:r>
+      <w:proofErr w:type="spellEnd"/>
+      <w:r>
+        <w:rPr>
+          <w:rFonts w:asciiTheme="minorEastAsia" w:eastAsiaTheme="minorEastAsia" w:hAnsiTheme="minorEastAsia" w:cs="굴림" w:hint="eastAsia"/>
+          <w:b/>
+          <w:bCs/>
+          <w:color w:val="auto"/>
+          <w:sz w:val="22"/>
+          <w:szCs w:val="22"/>
+        </w:rPr>
+        <w:t>”</w:t>
       </w:r>
     </w:p>
     <w:p>
@@ -8445,8 +9004,19 @@
           <w:sz w:val="22"/>
           <w:szCs w:val="22"/>
         </w:rPr>
-        <w:t>㈜에스비에스엠앤씨</w:t>
-      </w:r>
+        <w:t>㈜</w:t>
+      </w:r>
+      <w:proofErr w:type="spellStart"/>
+      <w:r>
+        <w:rPr>
+          <w:rFonts w:asciiTheme="minorEastAsia" w:eastAsiaTheme="minorEastAsia" w:hAnsiTheme="minorEastAsia" w:cs="굴림" w:hint="eastAsia"/>
+          <w:color w:val="auto"/>
+          <w:sz w:val="22"/>
+          <w:szCs w:val="22"/>
+        </w:rPr>
+        <w:t>에스비에스엠앤씨</w:t>
+      </w:r>
+      <w:proofErr w:type="spellEnd"/>
     </w:p>
     <w:p>
       <w:pPr>
@@ -8529,6 +9099,7 @@
         </w:rPr>
         <w:t>[</w:t>
       </w:r>
+      <w:proofErr w:type="gramStart"/>
       <w:r>
         <w:rPr>
           <w:rFonts w:asciiTheme="minorEastAsia" w:eastAsiaTheme="minorEastAsia" w:hAnsiTheme="minorEastAsia" w:cs="굴림" w:hint="eastAsia"/>
@@ -8557,7 +9128,18 @@
           <w:szCs w:val="22"/>
           <w:highlight w:val="yellow"/>
         </w:rPr>
-        <w:t xml:space="preserve">강 선 우 </w:t>
+        <w:t>강</w:t>
+      </w:r>
+      <w:proofErr w:type="gramEnd"/>
+      <w:r>
+        <w:rPr>
+          <w:rFonts w:asciiTheme="minorEastAsia" w:eastAsiaTheme="minorEastAsia" w:hAnsiTheme="minorEastAsia" w:cs="굴림" w:hint="eastAsia"/>
+          <w:color w:val="auto"/>
+          <w:sz w:val="22"/>
+          <w:szCs w:val="22"/>
+          <w:highlight w:val="yellow"/>
+        </w:rPr>
+        <w:t xml:space="preserve"> 선 우 </w:t>
       </w:r>
       <w:r>
         <w:rPr>
@@ -8851,91 +9433,6 @@
     </w:sectPr>
   </w:body>
 </w:document>
-</file>
-
-<file path=word/comments.xml><?xml version="1.0" encoding="utf-8"?>
-<w:comments xmlns:wpc="http://schemas.microsoft.com/office/word/2010/wordprocessingCanvas" xmlns:cx="http://schemas.microsoft.com/office/drawing/2014/chartex" xmlns:cx1="http://schemas.microsoft.com/office/drawing/2015/9/8/chartex" xmlns:cx2="http://schemas.microsoft.com/office/drawing/2015/10/21/chartex" xmlns:cx3="http://schemas.microsoft.com/office/drawing/2016/5/9/chartex" xmlns:cx4="http://schemas.microsoft.com/office/drawing/2016/5/10/chartex" xmlns:cx5="http://schemas.microsoft.com/office/drawing/2016/5/11/chartex" xmlns:cx6="http://schemas.microsoft.com/office/drawing/2016/5/12/chartex" xmlns:cx7="http://schemas.microsoft.com/office/drawing/2016/5/13/chartex" xmlns:cx8="http://schemas.microsoft.com/office/drawing/2016/5/14/chartex" xmlns:mc="http://schemas.openxmlformats.org/markup-compatibility/2006" xmlns:aink="http://schemas.microsoft.com/office/drawing/2016/ink" xmlns:am3d="http://schemas.microsoft.com/office/drawing/2017/model3d" xmlns:o="urn:schemas-microsoft-com:office:office" xmlns:oel="http://schemas.microsoft.com/office/2019/extlst" xmlns:r="http://schemas.openxmlformats.org/officeDocument/2006/relationships" xmlns:m="http://schemas.openxmlformats.org/officeDocument/2006/math" xmlns:v="urn:schemas-microsoft-com:vml" xmlns:wp14="http://schemas.microsoft.com/office/word/2010/wordprocessingDrawing" xmlns:wp="http://schemas.openxmlformats.org/drawingml/2006/wordprocessingDrawing" xmlns:w10="urn:schemas-microsoft-com:office:word" xmlns:w="http://schemas.openxmlformats.org/wordprocessingml/2006/main" xmlns:w14="http://schemas.microsoft.com/office/word/2010/wordml" xmlns:w15="http://schemas.microsoft.com/office/word/2012/wordml" xmlns:w16cex="http://schemas.microsoft.com/office/word/2018/wordml/cex" xmlns:w16cid="http://schemas.microsoft.com/office/word/2016/wordml/cid" xmlns:w16="http://schemas.microsoft.com/office/word/2018/wordml" xmlns:w16du="http://schemas.microsoft.com/office/word/2023/wordml/word16du" xmlns:w16sdtdh="http://schemas.microsoft.com/office/word/2020/wordml/sdtdatahash" xmlns:w16sdtfl="http://schemas.microsoft.com/office/word/2024/wordml/sdtformatlock" xmlns:w16se="http://schemas.microsoft.com/office/word/2015/wordml/symex" xmlns:wpg="http://schemas.microsoft.com/office/word/2010/wordprocessingGroup" xmlns:wpi="http://schemas.microsoft.com/office/word/2010/wordprocessingInk" xmlns:wne="http://schemas.microsoft.com/office/word/2006/wordml" xmlns:wps="http://schemas.microsoft.com/office/word/2010/wordprocessingShape" mc:Ignorable="w14 w15 w16se w16cid w16 w16cex w16sdtdh w16sdtfl w16du wp14">
-  <w:comment w:id="0" w:author="조우진" w:date="2026-04-02T10:42:00Z" w:initials="우조">
-    <w:p>
-      <w:pPr>
-        <w:pStyle w:val="a4"/>
-      </w:pPr>
-      <w:r>
-        <w:rPr>
-          <w:rStyle w:val="a7"/>
-        </w:rPr>
-        <w:annotationRef/>
-      </w:r>
-      <w:r>
-        <w:rPr>
-          <w:rFonts w:hint="eastAsia"/>
-        </w:rPr>
-        <w:t>판매하는 솔루션에 따라 작성</w:t>
-      </w:r>
-    </w:p>
-  </w:comment>
-  <w:comment w:id="1" w:author="조우진" w:date="2026-04-03T09:20:00Z" w:initials="우조">
-    <w:p>
-      <w:pPr>
-        <w:pStyle w:val="a4"/>
-      </w:pPr>
-      <w:r>
-        <w:rPr>
-          <w:rStyle w:val="a7"/>
-        </w:rPr>
-        <w:annotationRef/>
-      </w:r>
-      <w:r>
-        <w:t>SBS</w:t>
-      </w:r>
-      <w:r>
-        <w:rPr>
-          <w:rFonts w:hint="eastAsia"/>
-        </w:rPr>
-        <w:t>와의 계약서에는 간접</w:t>
-      </w:r>
-      <w:r>
-        <w:t>,</w:t>
-      </w:r>
-      <w:r>
-        <w:rPr>
-          <w:rFonts w:hint="eastAsia"/>
-        </w:rPr>
-        <w:t>가상</w:t>
-      </w:r>
-      <w:r>
-        <w:t>,</w:t>
-      </w:r>
-      <w:r>
-        <w:rPr>
-          <w:rFonts w:hint="eastAsia"/>
-        </w:rPr>
-        <w:t>일반 내용 불필요함으로 변환 시 삭제</w:t>
-      </w:r>
-    </w:p>
-  </w:comment>
-</w:comments>
-</file>
-
-<file path=word/commentsExtended.xml><?xml version="1.0" encoding="utf-8"?>
-<w15:commentsEx xmlns:wpc="http://schemas.microsoft.com/office/word/2010/wordprocessingCanvas" xmlns:cx="http://schemas.microsoft.com/office/drawing/2014/chartex" xmlns:cx1="http://schemas.microsoft.com/office/drawing/2015/9/8/chartex" xmlns:cx2="http://schemas.microsoft.com/office/drawing/2015/10/21/chartex" xmlns:cx3="http://schemas.microsoft.com/office/drawing/2016/5/9/chartex" xmlns:cx4="http://schemas.microsoft.com/office/drawing/2016/5/10/chartex" xmlns:cx5="http://schemas.microsoft.com/office/drawing/2016/5/11/chartex" xmlns:cx6="http://schemas.microsoft.com/office/drawing/2016/5/12/chartex" xmlns:cx7="http://schemas.microsoft.com/office/drawing/2016/5/13/chartex" xmlns:cx8="http://schemas.microsoft.com/office/drawing/2016/5/14/chartex" xmlns:mc="http://schemas.openxmlformats.org/markup-compatibility/2006" xmlns:aink="http://schemas.microsoft.com/office/drawing/2016/ink" xmlns:am3d="http://schemas.microsoft.com/office/drawing/2017/model3d" xmlns:o="urn:schemas-microsoft-com:office:office" xmlns:oel="http://schemas.microsoft.com/office/2019/extlst" xmlns:r="http://schemas.openxmlformats.org/officeDocument/2006/relationships" xmlns:m="http://schemas.openxmlformats.org/officeDocument/2006/math" xmlns:v="urn:schemas-microsoft-com:vml" xmlns:wp14="http://schemas.microsoft.com/office/word/2010/wordprocessingDrawing" xmlns:wp="http://schemas.openxmlformats.org/drawingml/2006/wordprocessingDrawing" xmlns:w10="urn:schemas-microsoft-com:office:word" xmlns:w="http://schemas.openxmlformats.org/wordprocessingml/2006/main" xmlns:w14="http://schemas.microsoft.com/office/word/2010/wordml" xmlns:w15="http://schemas.microsoft.com/office/word/2012/wordml" xmlns:w16cex="http://schemas.microsoft.com/office/word/2018/wordml/cex" xmlns:w16cid="http://schemas.microsoft.com/office/word/2016/wordml/cid" xmlns:w16="http://schemas.microsoft.com/office/word/2018/wordml" xmlns:w16du="http://schemas.microsoft.com/office/word/2023/wordml/word16du" xmlns:w16sdtdh="http://schemas.microsoft.com/office/word/2020/wordml/sdtdatahash" xmlns:w16sdtfl="http://schemas.microsoft.com/office/word/2024/wordml/sdtformatlock" xmlns:w16se="http://schemas.microsoft.com/office/word/2015/wordml/symex" xmlns:wpg="http://schemas.microsoft.com/office/word/2010/wordprocessingGroup" xmlns:wpi="http://schemas.microsoft.com/office/word/2010/wordprocessingInk" xmlns:wne="http://schemas.microsoft.com/office/word/2006/wordml" xmlns:wps="http://schemas.microsoft.com/office/word/2010/wordprocessingShape" mc:Ignorable="w14 w15 w16se w16cid w16 w16cex w16sdtdh w16sdtfl w16du wp14">
-  <w15:commentEx w15:paraId="0800F107" w15:done="0"/>
-  <w15:commentEx w15:paraId="385C955E" w15:done="0"/>
-</w15:commentsEx>
-</file>
-
-<file path=word/commentsExtensible.xml><?xml version="1.0" encoding="utf-8"?>
-<w16cex:commentsExtensible xmlns:wpc="http://schemas.microsoft.com/office/word/2010/wordprocessingCanvas" xmlns:cx="http://schemas.microsoft.com/office/drawing/2014/chartex" xmlns:cx1="http://schemas.microsoft.com/office/drawing/2015/9/8/chartex" xmlns:cx2="http://schemas.microsoft.com/office/drawing/2015/10/21/chartex" xmlns:cx3="http://schemas.microsoft.com/office/drawing/2016/5/9/chartex" xmlns:cx4="http://schemas.microsoft.com/office/drawing/2016/5/10/chartex" xmlns:cx5="http://schemas.microsoft.com/office/drawing/2016/5/11/chartex" xmlns:cx6="http://schemas.microsoft.com/office/drawing/2016/5/12/chartex" xmlns:cx7="http://schemas.microsoft.com/office/drawing/2016/5/13/chartex" xmlns:cx8="http://schemas.microsoft.com/office/drawing/2016/5/14/chartex" xmlns:cr="http://schemas.microsoft.com/office/comments/2020/reactions" xmlns:mc="http://schemas.openxmlformats.org/markup-compatibility/2006" xmlns:aink="http://schemas.microsoft.com/office/drawing/2016/ink" xmlns:am3d="http://schemas.microsoft.com/office/drawing/2017/model3d" xmlns:o="urn:schemas-microsoft-com:office:office" xmlns:oel="http://schemas.microsoft.com/office/2019/extlst" xmlns:r="http://schemas.openxmlformats.org/officeDocument/2006/relationships" xmlns:m="http://schemas.openxmlformats.org/officeDocument/2006/math" xmlns:v="urn:schemas-microsoft-com:vml" xmlns:wp14="http://schemas.microsoft.com/office/word/2010/wordprocessingDrawing" xmlns:wp="http://schemas.openxmlformats.org/drawingml/2006/wordprocessingDrawing" xmlns:w10="urn:schemas-microsoft-com:office:word" xmlns:w="http://schemas.openxmlformats.org/wordprocessingml/2006/main" xmlns:w14="http://schemas.microsoft.com/office/word/2010/wordml" xmlns:w15="http://schemas.microsoft.com/office/word/2012/wordml" xmlns:w16cex="http://schemas.microsoft.com/office/word/2018/wordml/cex" xmlns:w16cid="http://schemas.microsoft.com/office/word/2016/wordml/cid" xmlns:w16="http://schemas.microsoft.com/office/word/2018/wordml" xmlns:w16du="http://schemas.microsoft.com/office/word/2023/wordml/word16du" xmlns:w16sdtdh="http://schemas.microsoft.com/office/word/2020/wordml/sdtdatahash" xmlns:w16sdtfl="http://schemas.microsoft.com/office/word/2024/wordml/sdtformatlock" xmlns:w16se="http://schemas.microsoft.com/office/word/2015/wordml/symex" xmlns:wpg="http://schemas.microsoft.com/office/word/2010/wordprocessingGroup" xmlns:wpi="http://schemas.microsoft.com/office/word/2010/wordprocessingInk" xmlns:wne="http://schemas.microsoft.com/office/word/2006/wordml" xmlns:wps="http://schemas.microsoft.com/office/word/2010/wordprocessingShape" mc:Ignorable="w14 w15 w16se w16cid w16 w16cex w16sdtdh w16sdtfl cr w16du wp14">
-  <w16cex:commentExtensible w16cex:durableId="2EC26830" w16cex:dateUtc="2026-04-02T01:42:00Z"/>
-  <w16cex:commentExtensible w16cex:durableId="0866DA90" w16cex:dateUtc="2026-04-03T00:20:00Z"/>
-</w16cex:commentsExtensible>
-</file>
-
-<file path=word/commentsIds.xml><?xml version="1.0" encoding="utf-8"?>
-<w16cid:commentsIds xmlns:wpc="http://schemas.microsoft.com/office/word/2010/wordprocessingCanvas" xmlns:cx="http://schemas.microsoft.com/office/drawing/2014/chartex" xmlns:cx1="http://schemas.microsoft.com/office/drawing/2015/9/8/chartex" xmlns:cx2="http://schemas.microsoft.com/office/drawing/2015/10/21/chartex" xmlns:cx3="http://schemas.microsoft.com/office/drawing/2016/5/9/chartex" xmlns:cx4="http://schemas.microsoft.com/office/drawing/2016/5/10/chartex" xmlns:cx5="http://schemas.microsoft.com/office/drawing/2016/5/11/chartex" xmlns:cx6="http://schemas.microsoft.com/office/drawing/2016/5/12/chartex" xmlns:cx7="http://schemas.microsoft.com/office/drawing/2016/5/13/chartex" xmlns:cx8="http://schemas.microsoft.com/office/drawing/2016/5/14/chartex" xmlns:mc="http://schemas.openxmlformats.org/markup-compatibility/2006" xmlns:aink="http://schemas.microsoft.com/office/drawing/2016/ink" xmlns:am3d="http://schemas.microsoft.com/office/drawing/2017/model3d" xmlns:o="urn:schemas-microsoft-com:office:office" xmlns:oel="http://schemas.microsoft.com/office/2019/extlst" xmlns:r="http://schemas.openxmlformats.org/officeDocument/2006/relationships" xmlns:m="http://schemas.openxmlformats.org/officeDocument/2006/math" xmlns:v="urn:schemas-microsoft-com:vml" xmlns:wp14="http://schemas.microsoft.com/office/word/2010/wordprocessingDrawing" xmlns:wp="http://schemas.openxmlformats.org/drawingml/2006/wordprocessingDrawing" xmlns:w10="urn:schemas-microsoft-com:office:word" xmlns:w="http://schemas.openxmlformats.org/wordprocessingml/2006/main" xmlns:w14="http://schemas.microsoft.com/office/word/2010/wordml" xmlns:w15="http://schemas.microsoft.com/office/word/2012/wordml" xmlns:w16cex="http://schemas.microsoft.com/office/word/2018/wordml/cex" xmlns:w16cid="http://schemas.microsoft.com/office/word/2016/wordml/cid" xmlns:w16="http://schemas.microsoft.com/office/word/2018/wordml" xmlns:w16du="http://schemas.microsoft.com/office/word/2023/wordml/word16du" xmlns:w16sdtdh="http://schemas.microsoft.com/office/word/2020/wordml/sdtdatahash" xmlns:w16sdtfl="http://schemas.microsoft.com/office/word/2024/wordml/sdtformatlock" xmlns:w16se="http://schemas.microsoft.com/office/word/2015/wordml/symex" xmlns:wpg="http://schemas.microsoft.com/office/word/2010/wordprocessingGroup" xmlns:wpi="http://schemas.microsoft.com/office/word/2010/wordprocessingInk" xmlns:wne="http://schemas.microsoft.com/office/word/2006/wordml" xmlns:wps="http://schemas.microsoft.com/office/word/2010/wordprocessingShape" mc:Ignorable="w14 w15 w16se w16cid w16 w16cex w16sdtdh w16sdtfl w16du wp14">
-  <w16cid:commentId w16cid:paraId="0800F107" w16cid:durableId="2EC26830"/>
-  <w16cid:commentId w16cid:paraId="385C955E" w16cid:durableId="0866DA90"/>
-</w16cid:commentsIds>
 </file>
 
 <file path=word/endnotes.xml><?xml version="1.0" encoding="utf-8"?>
@@ -10322,14 +10819,6 @@
     <w:abstractNumId w:val="11"/>
   </w:num>
 </w:numbering>
-</file>
-
-<file path=word/people.xml><?xml version="1.0" encoding="utf-8"?>
-<w15:people xmlns:wpc="http://schemas.microsoft.com/office/word/2010/wordprocessingCanvas" xmlns:cx="http://schemas.microsoft.com/office/drawing/2014/chartex" xmlns:cx1="http://schemas.microsoft.com/office/drawing/2015/9/8/chartex" xmlns:cx2="http://schemas.microsoft.com/office/drawing/2015/10/21/chartex" xmlns:cx3="http://schemas.microsoft.com/office/drawing/2016/5/9/chartex" xmlns:cx4="http://schemas.microsoft.com/office/drawing/2016/5/10/chartex" xmlns:cx5="http://schemas.microsoft.com/office/drawing/2016/5/11/chartex" xmlns:cx6="http://schemas.microsoft.com/office/drawing/2016/5/12/chartex" xmlns:cx7="http://schemas.microsoft.com/office/drawing/2016/5/13/chartex" xmlns:cx8="http://schemas.microsoft.com/office/drawing/2016/5/14/chartex" xmlns:mc="http://schemas.openxmlformats.org/markup-compatibility/2006" xmlns:aink="http://schemas.microsoft.com/office/drawing/2016/ink" xmlns:am3d="http://schemas.microsoft.com/office/drawing/2017/model3d" xmlns:o="urn:schemas-microsoft-com:office:office" xmlns:oel="http://schemas.microsoft.com/office/2019/extlst" xmlns:r="http://schemas.openxmlformats.org/officeDocument/2006/relationships" xmlns:m="http://schemas.openxmlformats.org/officeDocument/2006/math" xmlns:v="urn:schemas-microsoft-com:vml" xmlns:wp14="http://schemas.microsoft.com/office/word/2010/wordprocessingDrawing" xmlns:wp="http://schemas.openxmlformats.org/drawingml/2006/wordprocessingDrawing" xmlns:w10="urn:schemas-microsoft-com:office:word" xmlns:w="http://schemas.openxmlformats.org/wordprocessingml/2006/main" xmlns:w14="http://schemas.microsoft.com/office/word/2010/wordml" xmlns:w15="http://schemas.microsoft.com/office/word/2012/wordml" xmlns:w16cex="http://schemas.microsoft.com/office/word/2018/wordml/cex" xmlns:w16cid="http://schemas.microsoft.com/office/word/2016/wordml/cid" xmlns:w16="http://schemas.microsoft.com/office/word/2018/wordml" xmlns:w16du="http://schemas.microsoft.com/office/word/2023/wordml/word16du" xmlns:w16sdtdh="http://schemas.microsoft.com/office/word/2020/wordml/sdtdatahash" xmlns:w16sdtfl="http://schemas.microsoft.com/office/word/2024/wordml/sdtformatlock" xmlns:w16se="http://schemas.microsoft.com/office/word/2015/wordml/symex" xmlns:wpg="http://schemas.microsoft.com/office/word/2010/wordprocessingGroup" xmlns:wpi="http://schemas.microsoft.com/office/word/2010/wordprocessingInk" xmlns:wne="http://schemas.microsoft.com/office/word/2006/wordml" xmlns:wps="http://schemas.microsoft.com/office/word/2010/wordprocessingShape" mc:Ignorable="w14 w15 w16se w16cid w16 w16cex w16sdtdh w16sdtfl w16du wp14">
-  <w15:person w15:author="조우진">
-    <w15:presenceInfo w15:providerId="AD" w15:userId="S::wcho@sbsmnc.onmicrosoft.com::b2db5454-b25b-47e6-a09e-b1f006032894"/>
-  </w15:person>
-</w15:people>
 </file>
 
 <file path=word/styles.xml><?xml version="1.0" encoding="utf-8"?>

</xml_diff>